<commit_message>
docs: los .docx al dia, incluido el 19 que no existia
Doce .md de 05_Funcional se corrigieron hoy y sus .docx se quedaron atras. Y
19_Especificacion_Placa_Portadora_ESP32 es nuevo y no tenia ninguno: sin el, el
paquete de entrega vuelve a abortar -que es su trabajo-.

Se regeneran ahora y no antes porque hasta hace un rato habia agentes escribiendo
esos mismos .md, y un .docx hecho sobre un documento en vuelo nace desfasado. Es
la misma razon por la que el acta se escribe sobre arbol limpio.

Co-Authored-By: Claude Opus 5 (1M context) <noreply@anthropic.com>
Claude-Session: https://claude.ai/code/session_01NXmwuf5tfkoc6C6EwbonL9
</commit_message>
<xml_diff>
--- a/05_Funcional/12_Cobertura_de_Pruebas_y_Huecos.docx
+++ b/05_Funcional/12_Cobertura_de_Pruebas_y_Huecos.docx
@@ -44,14 +44,14 @@
           <w:b/>
           <w:sz w:val="21"/>
         </w:rPr>
-        <w:t>Método:</w:t>
+        <w:t>Última revisión:</w:t>
       </w:r>
       <w:r>
         <w:rPr>
           <w:b w:val="0"/>
           <w:sz w:val="21"/>
         </w:rPr>
-        <w:t xml:space="preserve"> censo automático de la superficie de entrada del firmware cruzado contra los 20 packs</w:t>
+        <w:t xml:space="preserve"> 31 de agosto de 2026</w:t>
       </w:r>
     </w:p>
     <w:p>
@@ -60,10 +60,36 @@
       </w:pPr>
       <w:r>
         <w:rPr>
+          <w:b/>
+          <w:sz w:val="21"/>
+        </w:rPr>
+        <w:t>Método:</w:t>
+      </w:r>
+      <w:r>
+        <w:rPr>
           <w:b w:val="0"/>
           <w:sz w:val="21"/>
         </w:rPr>
-        <w:t xml:space="preserve">del banco. </w:t>
+        <w:t xml:space="preserve"> censo automático de la superficie de entrada del firmware cruzado contra ~~los 20 packs~~</w:t>
+      </w:r>
+    </w:p>
+    <w:p>
+      <w:pPr>
+        <w:spacing w:after="120"/>
+      </w:pPr>
+      <w:r>
+        <w:rPr>
+          <w:b/>
+          <w:sz w:val="21"/>
+        </w:rPr>
+        <w:t>los packs del banco</w:t>
+      </w:r>
+      <w:r>
+        <w:rPr>
+          <w:b w:val="0"/>
+          <w:sz w:val="21"/>
+        </w:rPr>
+        <w:t xml:space="preserve">. </w:t>
       </w:r>
       <w:r>
         <w:rPr>
@@ -77,7 +103,7 @@
           <w:b w:val="0"/>
           <w:sz w:val="21"/>
         </w:rPr>
-        <w:t>, y el</w:t>
+        <w:t>,</w:t>
       </w:r>
     </w:p>
     <w:p>
@@ -89,7 +115,293 @@
           <w:b w:val="0"/>
           <w:sz w:val="21"/>
         </w:rPr>
-        <w:t>comando que la produce está anotado para que cualquiera la repita.</w:t>
+        <w:t>y el comando que la produce está anotado para que cualquiera la repita.</w:t>
+      </w:r>
+    </w:p>
+    <w:p>
+      <w:pPr>
+        <w:spacing w:after="160"/>
+        <w:ind w:left="360"/>
+        <w:shd w:val="clear" w:fill="FFF4E5"/>
+      </w:pPr>
+      <w:r>
+        <w:rPr>
+          <w:b w:val="0"/>
+          <w:color w:val="960000"/>
+          <w:sz w:val="20"/>
+        </w:rPr>
+        <w:t xml:space="preserve">⚠️ 31/08 — ESTE DOCUMENTO YA NO PUBLICA CIFRAS DEL BANCO. REMITE AL ACTA Las ediciones anteriores decían *«los 20 packs · </w:t>
+      </w:r>
+      <w:r>
+        <w:rPr>
+          <w:rFonts w:ascii="Consolas" w:hAnsi="Consolas"/>
+          <w:color w:val="960000"/>
+          <w:sz w:val="20"/>
+        </w:rPr>
+        <w:t>155/155</w:t>
+      </w:r>
+      <w:r>
+        <w:rPr>
+          <w:b w:val="0"/>
+          <w:color w:val="960000"/>
+          <w:sz w:val="20"/>
+        </w:rPr>
+        <w:t xml:space="preserve">»*. </w:t>
+      </w:r>
+      <w:r>
+        <w:rPr>
+          <w:b/>
+          <w:color w:val="960000"/>
+          <w:sz w:val="20"/>
+        </w:rPr>
+        <w:t>Hoy son bastantes más y la cuenta se mueve cada hora</w:t>
+      </w:r>
+      <w:r>
+        <w:rPr>
+          <w:b w:val="0"/>
+          <w:color w:val="960000"/>
+          <w:sz w:val="20"/>
+        </w:rPr>
+        <w:t xml:space="preserve">, así que escribirla aquí a mano garantiza que envejezca en silencio — que es exactamente lo que este documento existe para evitar. </w:t>
+      </w:r>
+      <w:r>
+        <w:rPr>
+          <w:b/>
+          <w:color w:val="960000"/>
+          <w:sz w:val="20"/>
+        </w:rPr>
+        <w:t>La cifra vigente se lee del acta más reciente de `evidencia/`</w:t>
+      </w:r>
+      <w:r>
+        <w:rPr>
+          <w:b w:val="0"/>
+          <w:color w:val="960000"/>
+          <w:sz w:val="20"/>
+        </w:rPr>
+        <w:t xml:space="preserve"> —</w:t>
+      </w:r>
+      <w:r>
+        <w:rPr>
+          <w:rFonts w:ascii="Consolas" w:hAnsi="Consolas"/>
+          <w:color w:val="960000"/>
+          <w:sz w:val="20"/>
+        </w:rPr>
+        <w:t>evidencia/&lt;AAAA-MM-DD&gt;_compuerta.txt</w:t>
+      </w:r>
+      <w:r>
+        <w:rPr>
+          <w:b w:val="0"/>
+          <w:color w:val="960000"/>
+          <w:sz w:val="20"/>
+        </w:rPr>
+        <w:t xml:space="preserve">—, que la escribe </w:t>
+      </w:r>
+      <w:r>
+        <w:rPr>
+          <w:rFonts w:ascii="Consolas" w:hAnsi="Consolas"/>
+          <w:color w:val="960000"/>
+          <w:sz w:val="20"/>
+        </w:rPr>
+        <w:t>01_Firmware/compuerta.py</w:t>
+      </w:r>
+      <w:r>
+        <w:rPr>
+          <w:b w:val="0"/>
+          <w:color w:val="960000"/>
+          <w:sz w:val="20"/>
+        </w:rPr>
+        <w:t xml:space="preserve"> con la fecha y el hash de </w:t>
+      </w:r>
+      <w:r>
+        <w:rPr>
+          <w:rFonts w:ascii="Consolas" w:hAnsi="Consolas"/>
+          <w:color w:val="960000"/>
+          <w:sz w:val="20"/>
+        </w:rPr>
+        <w:t>HEAD</w:t>
+      </w:r>
+      <w:r>
+        <w:rPr>
+          <w:b w:val="0"/>
+          <w:color w:val="960000"/>
+          <w:sz w:val="20"/>
+        </w:rPr>
+        <w:t xml:space="preserve"> encima. </w:t>
+      </w:r>
+      <w:r>
+        <w:rPr>
+          <w:b/>
+          <w:color w:val="960000"/>
+          <w:sz w:val="20"/>
+        </w:rPr>
+        <w:t>Hay dos packs que vigilan que las cifras publicadas salgan del acta</w:t>
+      </w:r>
+      <w:r>
+        <w:rPr>
+          <w:b w:val="0"/>
+          <w:color w:val="960000"/>
+          <w:sz w:val="20"/>
+        </w:rPr>
+        <w:t>, no de la memoria de nadie. ``</w:t>
+      </w:r>
+      <w:r>
+        <w:rPr>
+          <w:rFonts w:ascii="Consolas" w:hAnsi="Consolas"/>
+          <w:color w:val="960000"/>
+          <w:sz w:val="20"/>
+        </w:rPr>
+        <w:t xml:space="preserve"> python 01_Firmware/compuerta.py                       # 0 PASS | 1 FALLA | 2 ABORTADO python 01_Firmware/Simulaciones/banco/correr.py --listar </w:t>
+      </w:r>
+      <w:r>
+        <w:rPr>
+          <w:rFonts w:ascii="Consolas" w:hAnsi="Consolas"/>
+          <w:color w:val="960000"/>
+          <w:sz w:val="20"/>
+        </w:rPr>
+      </w:r>
+      <w:r>
+        <w:rPr>
+          <w:rFonts w:ascii="Consolas" w:hAnsi="Consolas"/>
+          <w:color w:val="960000"/>
+          <w:sz w:val="20"/>
+        </w:rPr>
+        <w:t xml:space="preserve"> 🔴 **Y el acta se lee entera, no su primer número.** </w:t>
+      </w:r>
+      <w:r>
+        <w:rPr>
+          <w:b w:val="0"/>
+          <w:color w:val="960000"/>
+          <w:sz w:val="20"/>
+        </w:rPr>
+        <w:t>ABORTADO</w:t>
+      </w:r>
+      <w:r>
+        <w:rPr>
+          <w:rFonts w:ascii="Consolas" w:hAnsi="Consolas"/>
+          <w:color w:val="960000"/>
+          <w:sz w:val="20"/>
+        </w:rPr>
+        <w:t xml:space="preserve"> **no es** </w:t>
+      </w:r>
+      <w:r>
+        <w:rPr>
+          <w:b w:val="0"/>
+          <w:color w:val="960000"/>
+          <w:sz w:val="20"/>
+        </w:rPr>
+        <w:t>PASS</w:t>
+      </w:r>
+      <w:r>
+        <w:rPr>
+          <w:rFonts w:ascii="Consolas" w:hAnsi="Consolas"/>
+          <w:color w:val="960000"/>
+          <w:sz w:val="20"/>
+        </w:rPr>
+        <w:t xml:space="preserve">: una comprobación que no pudo correr **no dice nada del firmware**. Un </w:t>
+      </w:r>
+      <w:r>
+        <w:rPr>
+          <w:b w:val="0"/>
+          <w:color w:val="960000"/>
+          <w:sz w:val="20"/>
+        </w:rPr>
+        <w:t>x/y</w:t>
+      </w:r>
+      <w:r>
+        <w:rPr>
+          <w:rFonts w:ascii="Consolas" w:hAnsi="Consolas"/>
+          <w:color w:val="960000"/>
+          <w:sz w:val="20"/>
+        </w:rPr>
+        <w:t xml:space="preserve"> con </w:t>
+      </w:r>
+      <w:r>
+        <w:rPr>
+          <w:b w:val="0"/>
+          <w:color w:val="960000"/>
+          <w:sz w:val="20"/>
+        </w:rPr>
+        <w:t xml:space="preserve">x != y` significa que hay comprobaciones que no cumplen, lo escriba como lo escriba el instrumento y salga con el código que salga. </w:t>
+      </w:r>
+      <w:r>
+        <w:rPr>
+          <w:b/>
+          <w:color w:val="960000"/>
+          <w:sz w:val="20"/>
+        </w:rPr>
+        <w:t>Y el acta del 31/08 no está en verde.</w:t>
+      </w:r>
+      <w:r>
+        <w:rPr>
+          <w:b w:val="0"/>
+          <w:color w:val="960000"/>
+          <w:sz w:val="20"/>
+        </w:rPr>
+        <w:t xml:space="preserve"> </w:t>
+      </w:r>
+      <w:r>
+        <w:rPr>
+          <w:b/>
+          <w:color w:val="960000"/>
+          <w:sz w:val="20"/>
+        </w:rPr>
+        <w:t>Nada de esto es un permiso.</w:t>
+      </w:r>
+      <w:r>
+        <w:rPr>
+          <w:b w:val="0"/>
+          <w:color w:val="960000"/>
+          <w:sz w:val="20"/>
+        </w:rPr>
+        <w:t xml:space="preserve"> En campo corre la </w:t>
+      </w:r>
+      <w:r>
+        <w:rPr>
+          <w:b/>
+          <w:color w:val="960000"/>
+          <w:sz w:val="20"/>
+        </w:rPr>
+        <w:t>V8.4</w:t>
+      </w:r>
+      <w:r>
+        <w:rPr>
+          <w:b w:val="0"/>
+          <w:color w:val="960000"/>
+          <w:sz w:val="20"/>
+        </w:rPr>
+        <w:t xml:space="preserve">, y </w:t>
+      </w:r>
+      <w:r>
+        <w:rPr>
+          <w:b/>
+          <w:color w:val="960000"/>
+          <w:sz w:val="20"/>
+        </w:rPr>
+        <w:t>verde no es entregable</w:t>
+      </w:r>
+      <w:r>
+        <w:rPr>
+          <w:b w:val="0"/>
+          <w:color w:val="960000"/>
+          <w:sz w:val="20"/>
+        </w:rPr>
+        <w:t xml:space="preserve">: la compuerta dice que los modelos y los arneses de PC no encuentran nada, </w:t>
+      </w:r>
+      <w:r>
+        <w:rPr>
+          <w:b/>
+          <w:color w:val="960000"/>
+          <w:sz w:val="20"/>
+        </w:rPr>
+        <w:t>no que el firmware funcione en la tarjeta</w:t>
+      </w:r>
+      <w:r>
+        <w:rPr>
+          <w:b w:val="0"/>
+          <w:color w:val="960000"/>
+          <w:sz w:val="20"/>
+        </w:rPr>
+        <w:t>.</w:t>
       </w:r>
     </w:p>
     <w:p>
@@ -213,183 +525,23 @@
           <w:color w:val="003366"/>
           <w:sz w:val="26"/>
         </w:rPr>
-        <w:t>1. 🔴 Hallazgo de esta pasada: las cámaras 2 y 4 no existen en el firmware</w:t>
+        <w:t xml:space="preserve">1. ✅ CERRADO (31/08) — </w:t>
       </w:r>
-    </w:p>
-    <w:p>
-      <w:pPr>
-        <w:spacing w:after="200"/>
-        <w:ind w:left="288"/>
-        <w:shd w:val="clear" w:fill="F4F4F4"/>
-      </w:pPr>
       <w:r>
         <w:rPr>
           <w:rFonts w:ascii="Consolas" w:hAnsi="Consolas"/>
-          <w:sz w:val="18"/>
+          <w:color w:val="003366"/>
+          <w:sz w:val="26"/>
         </w:rPr>
-        <w:t>$ grep -rn "CAM_UMBRAL_PIN" --include=*.cpp Maestro/src Esclavo/src</w:t>
-        <w:br/>
-        <w:t>Maestro/src/modo_inteligente.cpp:29:  pinMode(CAM_UMBRAL_PIN, INPUT_PULLUP);</w:t>
-        <w:br/>
-        <w:t>Esclavo/src/main.cpp:275:            pinMode(CAM_UMBRAL_PIN, INPUT_PULLUP);</w:t>
-      </w:r>
-    </w:p>
-    <w:p>
-      <w:pPr>
-        <w:spacing w:after="120"/>
-      </w:pPr>
-      <w:r>
-        <w:rPr>
-          <w:b/>
-          <w:sz w:val="21"/>
-        </w:rPr>
-        <w:t>Eso es todo.</w:t>
-      </w:r>
-      <w:r>
-        <w:rPr>
-          <w:b w:val="0"/>
-          <w:sz w:val="21"/>
-        </w:rPr>
-        <w:t xml:space="preserve"> El pin se configura como entrada y </w:t>
+        <w:t>CAM_UMBRAL_PIN</w:t>
       </w:r>
       <w:r>
         <w:rPr>
           <w:b/>
-          <w:sz w:val="21"/>
+          <w:color w:val="003366"/>
+          <w:sz w:val="26"/>
         </w:rPr>
-        <w:t>no se lee nunca</w:t>
-      </w:r>
-      <w:r>
-        <w:rPr>
-          <w:b w:val="0"/>
-          <w:sz w:val="21"/>
-        </w:rPr>
-        <w:t>: no hay un solo</w:t>
-      </w:r>
-    </w:p>
-    <w:p>
-      <w:pPr>
-        <w:spacing w:after="120"/>
-      </w:pPr>
-      <w:r>
-        <w:rPr>
-          <w:rFonts w:ascii="Consolas" w:hAnsi="Consolas"/>
-          <w:sz w:val="21"/>
-        </w:rPr>
-        <w:t>digitalRead(CAM_UMBRAL_PIN)</w:t>
-      </w:r>
-      <w:r>
-        <w:rPr>
-          <w:b w:val="0"/>
-          <w:sz w:val="21"/>
-        </w:rPr>
-        <w:t xml:space="preserve"> en ninguno de los dos microcontroladores. El censo completo de</w:t>
-      </w:r>
-    </w:p>
-    <w:p>
-      <w:pPr>
-        <w:spacing w:after="120"/>
-      </w:pPr>
-      <w:r>
-        <w:rPr>
-          <w:b w:val="0"/>
-          <w:sz w:val="21"/>
-        </w:rPr>
-        <w:t xml:space="preserve">entradas físicas lo confirma —solo aparece </w:t>
-      </w:r>
-      <w:r>
-        <w:rPr>
-          <w:rFonts w:ascii="Consolas" w:hAnsi="Consolas"/>
-          <w:sz w:val="21"/>
-        </w:rPr>
-        <w:t>CAM_DEMANDA_PIN</w:t>
-      </w:r>
-      <w:r>
-        <w:rPr>
-          <w:b w:val="0"/>
-          <w:sz w:val="21"/>
-        </w:rPr>
-        <w:t>—.</w:t>
-      </w:r>
-    </w:p>
-    <w:p>
-      <w:pPr>
-        <w:spacing w:after="120"/>
-      </w:pPr>
-      <w:r>
-        <w:rPr>
-          <w:b w:val="0"/>
-          <w:sz w:val="21"/>
-        </w:rPr>
-        <w:t xml:space="preserve">Mientras tanto, </w:t>
-      </w:r>
-      <w:r>
-        <w:rPr>
-          <w:b/>
-          <w:sz w:val="21"/>
-        </w:rPr>
-        <w:t>cuatro documentos afirman lo contrario</w:t>
-      </w:r>
-      <w:r>
-        <w:rPr>
-          <w:b w:val="0"/>
-          <w:sz w:val="21"/>
-        </w:rPr>
-        <w:t>: el Manual 9 de cámaras, el Manual 10 de</w:t>
-      </w:r>
-    </w:p>
-    <w:p>
-      <w:pPr>
-        <w:spacing w:after="120"/>
-      </w:pPr>
-      <w:r>
-        <w:rPr>
-          <w:b w:val="0"/>
-          <w:sz w:val="21"/>
-        </w:rPr>
-        <w:t xml:space="preserve">Bluetooth, </w:t>
-      </w:r>
-      <w:r>
-        <w:rPr>
-          <w:rFonts w:ascii="Consolas" w:hAnsi="Consolas"/>
-          <w:sz w:val="21"/>
-        </w:rPr>
-        <w:t>ESTADO.md</w:t>
-      </w:r>
-      <w:r>
-        <w:rPr>
-          <w:b w:val="0"/>
-          <w:sz w:val="21"/>
-        </w:rPr>
-        <w:t xml:space="preserve"> y </w:t>
-      </w:r>
-      <w:r>
-        <w:rPr>
-          <w:rFonts w:ascii="Consolas" w:hAnsi="Consolas"/>
-          <w:sz w:val="21"/>
-        </w:rPr>
-        <w:t>roadmap.md</w:t>
-      </w:r>
-      <w:r>
-        <w:rPr>
-          <w:b w:val="0"/>
-          <w:sz w:val="21"/>
-        </w:rPr>
-        <w:t xml:space="preserve"> describen </w:t>
-      </w:r>
-      <w:r>
-        <w:rPr>
-          <w:rFonts w:ascii="Consolas" w:hAnsi="Consolas"/>
-          <w:sz w:val="21"/>
-        </w:rPr>
-        <w:t>PB8</w:t>
-      </w:r>
-      <w:r>
-        <w:rPr>
-          <w:b w:val="0"/>
-          <w:sz w:val="21"/>
-        </w:rPr>
-        <w:t xml:space="preserve"> como *"Umbral de tramo"* con función activa.</w:t>
+        <w:t xml:space="preserve"> ya no existe, y las cámaras están en otro sitio</w:t>
       </w:r>
     </w:p>
     <w:p>
@@ -404,7 +556,7 @@
           <w:color w:val="960000"/>
           <w:sz w:val="20"/>
         </w:rPr>
-        <w:t>Un `pinMode()` sin `digitalRead()` es exactamente el patrón de la prueba muerta que este repositorio ya conoce:</w:t>
+        <w:t>El hallazgo era correcto y se ha resuelto por la raíz: `PB8` nunca fue una entrada de cámara.</w:t>
       </w:r>
       <w:r>
         <w:rPr>
@@ -412,1195 +564,8 @@
           <w:color w:val="960000"/>
           <w:sz w:val="20"/>
         </w:rPr>
-        <w:t xml:space="preserve"> algo que *parece* conectado, que compila, que pasa la compuerta, y que no hace nada. Se descubrió censando, no leyendo el manual — porque el manual decía que sí funcionaba.</w:t>
+        <w:t xml:space="preserve"> Se conserva íntegro debajo, porque el patrón que describe es reutilizable y volverá a aparecer.</w:t>
       </w:r>
-    </w:p>
-    <w:p>
-      <w:pPr>
-        <w:spacing w:after="80"/>
-      </w:pPr>
-    </w:p>
-    <w:p>
-      <w:pPr>
-        <w:spacing w:before="280" w:after="120"/>
-      </w:pPr>
-      <w:r>
-        <w:rPr>
-          <w:b/>
-          <w:color w:val="003366"/>
-          <w:sz w:val="26"/>
-        </w:rPr>
-        <w:t>2. Superficie de entrada completa, cruzada con el banco</w:t>
-      </w:r>
-    </w:p>
-    <w:p>
-      <w:pPr>
-        <w:spacing w:after="120"/>
-      </w:pPr>
-      <w:r>
-        <w:rPr>
-          <w:b w:val="0"/>
-          <w:sz w:val="21"/>
-        </w:rPr>
-        <w:t>Todo lo que puede meter información al sistema, y qué lo prueba:</w:t>
-      </w:r>
-    </w:p>
-    <w:tbl>
-      <w:tblPr>
-        <w:tblStyle w:val="TableGrid"/>
-        <w:tblW w:type="auto" w:w="0"/>
-        <w:tblLook w:firstColumn="1" w:firstRow="1" w:lastColumn="0" w:lastRow="0" w:noHBand="0" w:noVBand="1" w:val="04A0"/>
-      </w:tblPr>
-      <w:tblGrid>
-        <w:gridCol w:w="1560"/>
-        <w:gridCol w:w="1560"/>
-        <w:gridCol w:w="1560"/>
-        <w:gridCol w:w="1560"/>
-        <w:gridCol w:w="1560"/>
-        <w:gridCol w:w="1560"/>
-      </w:tblGrid>
-      <w:tr>
-        <w:tc>
-          <w:tcPr>
-            <w:tcW w:type="dxa" w:w="1560"/>
-            <w:shd w:val="clear" w:fill="DCE6F1"/>
-          </w:tcPr>
-          <w:p>
-            <w:r/>
-            <w:r>
-              <w:rPr>
-                <w:b/>
-                <w:sz w:val="19"/>
-              </w:rPr>
-              <w:t>#</w:t>
-            </w:r>
-          </w:p>
-        </w:tc>
-        <w:tc>
-          <w:tcPr>
-            <w:tcW w:type="dxa" w:w="1560"/>
-            <w:shd w:val="clear" w:fill="DCE6F1"/>
-          </w:tcPr>
-          <w:p>
-            <w:r/>
-            <w:r>
-              <w:rPr>
-                <w:b/>
-                <w:sz w:val="19"/>
-              </w:rPr>
-              <w:t>Entrada</w:t>
-            </w:r>
-          </w:p>
-        </w:tc>
-        <w:tc>
-          <w:tcPr>
-            <w:tcW w:type="dxa" w:w="1560"/>
-            <w:shd w:val="clear" w:fill="DCE6F1"/>
-          </w:tcPr>
-          <w:p>
-            <w:r/>
-            <w:r>
-              <w:rPr>
-                <w:b/>
-                <w:sz w:val="19"/>
-              </w:rPr>
-              <w:t>Canal</w:t>
-            </w:r>
-          </w:p>
-        </w:tc>
-        <w:tc>
-          <w:tcPr>
-            <w:tcW w:type="dxa" w:w="1560"/>
-            <w:shd w:val="clear" w:fill="DCE6F1"/>
-          </w:tcPr>
-          <w:p>
-            <w:r/>
-            <w:r>
-              <w:rPr>
-                <w:b/>
-                <w:sz w:val="19"/>
-              </w:rPr>
-              <w:t>Qué acepta</w:t>
-            </w:r>
-          </w:p>
-        </w:tc>
-        <w:tc>
-          <w:tcPr>
-            <w:tcW w:type="dxa" w:w="1560"/>
-            <w:shd w:val="clear" w:fill="DCE6F1"/>
-          </w:tcPr>
-          <w:p>
-            <w:r/>
-            <w:r>
-              <w:rPr>
-                <w:b/>
-                <w:sz w:val="19"/>
-              </w:rPr>
-              <w:t>Pack que lo cubre</w:t>
-            </w:r>
-          </w:p>
-        </w:tc>
-        <w:tc>
-          <w:tcPr>
-            <w:tcW w:type="dxa" w:w="1560"/>
-            <w:shd w:val="clear" w:fill="DCE6F1"/>
-          </w:tcPr>
-          <w:p>
-            <w:r/>
-            <w:r>
-              <w:rPr>
-                <w:b/>
-                <w:sz w:val="19"/>
-              </w:rPr>
-              <w:t>Estado</w:t>
-            </w:r>
-          </w:p>
-        </w:tc>
-      </w:tr>
-      <w:tr>
-        <w:tc>
-          <w:tcPr>
-            <w:tcW w:type="dxa" w:w="1560"/>
-          </w:tcPr>
-          <w:p>
-            <w:r/>
-            <w:r>
-              <w:rPr>
-                <w:b w:val="0"/>
-                <w:sz w:val="19"/>
-              </w:rPr>
-              <w:t>1</w:t>
-            </w:r>
-          </w:p>
-        </w:tc>
-        <w:tc>
-          <w:tcPr>
-            <w:tcW w:type="dxa" w:w="1560"/>
-          </w:tcPr>
-          <w:p>
-            <w:r/>
-            <w:r>
-              <w:rPr>
-                <w:b w:val="0"/>
-                <w:sz w:val="19"/>
-              </w:rPr>
-              <w:t>4 botones locales</w:t>
-            </w:r>
-          </w:p>
-        </w:tc>
-        <w:tc>
-          <w:tcPr>
-            <w:tcW w:type="dxa" w:w="1560"/>
-          </w:tcPr>
-          <w:p>
-            <w:r/>
-            <w:r>
-              <w:rPr>
-                <w:rFonts w:ascii="Consolas" w:hAnsi="Consolas"/>
-                <w:sz w:val="19"/>
-              </w:rPr>
-              <w:t>PB9</w:t>
-            </w:r>
-            <w:r>
-              <w:rPr>
-                <w:b w:val="0"/>
-                <w:sz w:val="19"/>
-              </w:rPr>
-              <w:t xml:space="preserve"> </w:t>
-            </w:r>
-            <w:r>
-              <w:rPr>
-                <w:rFonts w:ascii="Consolas" w:hAnsi="Consolas"/>
-                <w:sz w:val="19"/>
-              </w:rPr>
-              <w:t>PB13</w:t>
-            </w:r>
-            <w:r>
-              <w:rPr>
-                <w:b w:val="0"/>
-                <w:sz w:val="19"/>
-              </w:rPr>
-              <w:t xml:space="preserve"> </w:t>
-            </w:r>
-            <w:r>
-              <w:rPr>
-                <w:rFonts w:ascii="Consolas" w:hAnsi="Consolas"/>
-                <w:sz w:val="19"/>
-              </w:rPr>
-              <w:t>PB14</w:t>
-            </w:r>
-            <w:r>
-              <w:rPr>
-                <w:b w:val="0"/>
-                <w:sz w:val="19"/>
-              </w:rPr>
-              <w:t xml:space="preserve"> </w:t>
-            </w:r>
-            <w:r>
-              <w:rPr>
-                <w:rFonts w:ascii="Consolas" w:hAnsi="Consolas"/>
-                <w:sz w:val="19"/>
-              </w:rPr>
-              <w:t>PB15</w:t>
-            </w:r>
-          </w:p>
-        </w:tc>
-        <w:tc>
-          <w:tcPr>
-            <w:tcW w:type="dxa" w:w="1560"/>
-          </w:tcPr>
-          <w:p>
-            <w:r/>
-            <w:r>
-              <w:rPr>
-                <w:b w:val="0"/>
-                <w:sz w:val="19"/>
-              </w:rPr>
-              <w:t>secuencias A/B</w:t>
-            </w:r>
-          </w:p>
-        </w:tc>
-        <w:tc>
-          <w:tcPr>
-            <w:tcW w:type="dxa" w:w="1560"/>
-          </w:tcPr>
-          <w:p>
-            <w:r/>
-            <w:r>
-              <w:rPr>
-                <w:rFonts w:ascii="Consolas" w:hAnsi="Consolas"/>
-                <w:sz w:val="19"/>
-              </w:rPr>
-              <w:t>maestro_01_mando</w:t>
-            </w:r>
-            <w:r>
-              <w:rPr>
-                <w:b w:val="0"/>
-                <w:sz w:val="19"/>
-              </w:rPr>
-              <w:t xml:space="preserve"> (15), </w:t>
-            </w:r>
-            <w:r>
-              <w:rPr>
-                <w:rFonts w:ascii="Consolas" w:hAnsi="Consolas"/>
-                <w:sz w:val="19"/>
-              </w:rPr>
-              <w:t>esclavo_02_inhibicion_menu</w:t>
-            </w:r>
-            <w:r>
-              <w:rPr>
-                <w:b w:val="0"/>
-                <w:sz w:val="19"/>
-              </w:rPr>
-              <w:t xml:space="preserve"> (7)</w:t>
-            </w:r>
-          </w:p>
-        </w:tc>
-        <w:tc>
-          <w:tcPr>
-            <w:tcW w:type="dxa" w:w="1560"/>
-          </w:tcPr>
-          <w:p>
-            <w:r/>
-            <w:r>
-              <w:rPr>
-                <w:b w:val="0"/>
-                <w:sz w:val="19"/>
-              </w:rPr>
-              <w:t>✅</w:t>
-            </w:r>
-          </w:p>
-        </w:tc>
-      </w:tr>
-      <w:tr>
-        <w:tc>
-          <w:tcPr>
-            <w:tcW w:type="dxa" w:w="1560"/>
-          </w:tcPr>
-          <w:p>
-            <w:r/>
-            <w:r>
-              <w:rPr>
-                <w:b w:val="0"/>
-                <w:sz w:val="19"/>
-              </w:rPr>
-              <w:t>2</w:t>
-            </w:r>
-          </w:p>
-        </w:tc>
-        <w:tc>
-          <w:tcPr>
-            <w:tcW w:type="dxa" w:w="1560"/>
-          </w:tcPr>
-          <w:p>
-            <w:r/>
-            <w:r>
-              <w:rPr>
-                <w:b w:val="0"/>
-                <w:sz w:val="19"/>
-              </w:rPr>
-              <w:t>Mando de 4 relés</w:t>
-            </w:r>
-          </w:p>
-        </w:tc>
-        <w:tc>
-          <w:tcPr>
-            <w:tcW w:type="dxa" w:w="1560"/>
-          </w:tcPr>
-          <w:p>
-            <w:r/>
-            <w:r>
-              <w:rPr>
-                <w:b/>
-                <w:sz w:val="19"/>
-              </w:rPr>
-              <w:t>los mismos 4 pines</w:t>
-            </w:r>
-          </w:p>
-        </w:tc>
-        <w:tc>
-          <w:tcPr>
-            <w:tcW w:type="dxa" w:w="1560"/>
-          </w:tcPr>
-          <w:p>
-            <w:r/>
-            <w:r>
-              <w:rPr>
-                <w:b w:val="0"/>
-                <w:sz w:val="19"/>
-              </w:rPr>
-              <w:t>idem</w:t>
-            </w:r>
-          </w:p>
-        </w:tc>
-        <w:tc>
-          <w:tcPr>
-            <w:tcW w:type="dxa" w:w="1560"/>
-          </w:tcPr>
-          <w:p>
-            <w:r/>
-            <w:r>
-              <w:rPr>
-                <w:b w:val="0"/>
-                <w:sz w:val="19"/>
-              </w:rPr>
-              <w:t>idem</w:t>
-            </w:r>
-          </w:p>
-        </w:tc>
-        <w:tc>
-          <w:tcPr>
-            <w:tcW w:type="dxa" w:w="1560"/>
-          </w:tcPr>
-          <w:p>
-            <w:r/>
-            <w:r>
-              <w:rPr>
-                <w:b w:val="0"/>
-                <w:sz w:val="19"/>
-              </w:rPr>
-              <w:t>✅</w:t>
-            </w:r>
-          </w:p>
-        </w:tc>
-      </w:tr>
-      <w:tr>
-        <w:tc>
-          <w:tcPr>
-            <w:tcW w:type="dxa" w:w="1560"/>
-          </w:tcPr>
-          <w:p>
-            <w:r/>
-            <w:r>
-              <w:rPr>
-                <w:b w:val="0"/>
-                <w:sz w:val="19"/>
-              </w:rPr>
-              <w:t>3</w:t>
-            </w:r>
-          </w:p>
-        </w:tc>
-        <w:tc>
-          <w:tcPr>
-            <w:tcW w:type="dxa" w:w="1560"/>
-          </w:tcPr>
-          <w:p>
-            <w:r/>
-            <w:r>
-              <w:rPr>
-                <w:b w:val="0"/>
-                <w:sz w:val="19"/>
-              </w:rPr>
-              <w:t>Cámara de demanda</w:t>
-            </w:r>
-          </w:p>
-        </w:tc>
-        <w:tc>
-          <w:tcPr>
-            <w:tcW w:type="dxa" w:w="1560"/>
-          </w:tcPr>
-          <w:p>
-            <w:r/>
-            <w:r>
-              <w:rPr>
-                <w:rFonts w:ascii="Consolas" w:hAnsi="Consolas"/>
-                <w:sz w:val="19"/>
-              </w:rPr>
-              <w:t>PB0</w:t>
-            </w:r>
-          </w:p>
-        </w:tc>
-        <w:tc>
-          <w:tcPr>
-            <w:tcW w:type="dxa" w:w="1560"/>
-          </w:tcPr>
-          <w:p>
-            <w:r/>
-            <w:r>
-              <w:rPr>
-                <w:b w:val="0"/>
-                <w:sz w:val="19"/>
-              </w:rPr>
-              <w:t>binario con antirrebote</w:t>
-            </w:r>
-          </w:p>
-        </w:tc>
-        <w:tc>
-          <w:tcPr>
-            <w:tcW w:type="dxa" w:w="1560"/>
-          </w:tcPr>
-          <w:p>
-            <w:r/>
-            <w:r>
-              <w:rPr>
-                <w:b/>
-                <w:sz w:val="19"/>
-              </w:rPr>
-              <w:t>ninguno</w:t>
-            </w:r>
-          </w:p>
-        </w:tc>
-        <w:tc>
-          <w:tcPr>
-            <w:tcW w:type="dxa" w:w="1560"/>
-          </w:tcPr>
-          <w:p>
-            <w:r/>
-            <w:r>
-              <w:rPr>
-                <w:b w:val="0"/>
-                <w:sz w:val="19"/>
-              </w:rPr>
-              <w:t>❌</w:t>
-            </w:r>
-          </w:p>
-        </w:tc>
-      </w:tr>
-      <w:tr>
-        <w:tc>
-          <w:tcPr>
-            <w:tcW w:type="dxa" w:w="1560"/>
-          </w:tcPr>
-          <w:p>
-            <w:r/>
-            <w:r>
-              <w:rPr>
-                <w:b w:val="0"/>
-                <w:sz w:val="19"/>
-              </w:rPr>
-              <w:t>4</w:t>
-            </w:r>
-          </w:p>
-        </w:tc>
-        <w:tc>
-          <w:tcPr>
-            <w:tcW w:type="dxa" w:w="1560"/>
-          </w:tcPr>
-          <w:p>
-            <w:r/>
-            <w:r>
-              <w:rPr>
-                <w:b w:val="0"/>
-                <w:sz w:val="19"/>
-              </w:rPr>
-              <w:t>Cámara de umbral</w:t>
-            </w:r>
-          </w:p>
-        </w:tc>
-        <w:tc>
-          <w:tcPr>
-            <w:tcW w:type="dxa" w:w="1560"/>
-          </w:tcPr>
-          <w:p>
-            <w:r/>
-            <w:r>
-              <w:rPr>
-                <w:rFonts w:ascii="Consolas" w:hAnsi="Consolas"/>
-                <w:sz w:val="19"/>
-              </w:rPr>
-              <w:t>PB8</w:t>
-            </w:r>
-          </w:p>
-        </w:tc>
-        <w:tc>
-          <w:tcPr>
-            <w:tcW w:type="dxa" w:w="1560"/>
-          </w:tcPr>
-          <w:p>
-            <w:r/>
-            <w:r>
-              <w:rPr>
-                <w:b/>
-                <w:sz w:val="19"/>
-              </w:rPr>
-              <w:t>nada: no se lee</w:t>
-            </w:r>
-          </w:p>
-        </w:tc>
-        <w:tc>
-          <w:tcPr>
-            <w:tcW w:type="dxa" w:w="1560"/>
-          </w:tcPr>
-          <w:p>
-            <w:r/>
-            <w:r>
-              <w:rPr>
-                <w:b/>
-                <w:sz w:val="19"/>
-              </w:rPr>
-              <w:t>ninguno</w:t>
-            </w:r>
-          </w:p>
-        </w:tc>
-        <w:tc>
-          <w:tcPr>
-            <w:tcW w:type="dxa" w:w="1560"/>
-          </w:tcPr>
-          <w:p>
-            <w:r/>
-            <w:r>
-              <w:rPr>
-                <w:b w:val="0"/>
-                <w:sz w:val="19"/>
-              </w:rPr>
-              <w:t>🔴 §1</w:t>
-            </w:r>
-          </w:p>
-        </w:tc>
-      </w:tr>
-      <w:tr>
-        <w:tc>
-          <w:tcPr>
-            <w:tcW w:type="dxa" w:w="1560"/>
-          </w:tcPr>
-          <w:p>
-            <w:r/>
-            <w:r>
-              <w:rPr>
-                <w:b w:val="0"/>
-                <w:sz w:val="19"/>
-              </w:rPr>
-              <w:t>5</w:t>
-            </w:r>
-          </w:p>
-        </w:tc>
-        <w:tc>
-          <w:tcPr>
-            <w:tcW w:type="dxa" w:w="1560"/>
-          </w:tcPr>
-          <w:p>
-            <w:r/>
-            <w:r>
-              <w:rPr>
-                <w:b w:val="0"/>
-                <w:sz w:val="19"/>
-              </w:rPr>
-              <w:t>Radio LoRa</w:t>
-            </w:r>
-          </w:p>
-        </w:tc>
-        <w:tc>
-          <w:tcPr>
-            <w:tcW w:type="dxa" w:w="1560"/>
-          </w:tcPr>
-          <w:p>
-            <w:r/>
-            <w:r>
-              <w:rPr>
-                <w:rFonts w:ascii="Consolas" w:hAnsi="Consolas"/>
-                <w:sz w:val="19"/>
-              </w:rPr>
-              <w:t>USART3</w:t>
-            </w:r>
-          </w:p>
-        </w:tc>
-        <w:tc>
-          <w:tcPr>
-            <w:tcW w:type="dxa" w:w="1560"/>
-          </w:tcPr>
-          <w:p>
-            <w:r/>
-            <w:r>
-              <w:rPr>
-                <w:b/>
-                <w:sz w:val="19"/>
-              </w:rPr>
-              <w:t>18</w:t>
-            </w:r>
-            <w:r>
-              <w:rPr>
-                <w:b w:val="0"/>
-                <w:sz w:val="19"/>
-              </w:rPr>
-              <w:t xml:space="preserve"> comandos </w:t>
-            </w:r>
-            <w:r>
-              <w:rPr>
-                <w:rFonts w:ascii="Consolas" w:hAnsi="Consolas"/>
-                <w:sz w:val="19"/>
-              </w:rPr>
-              <w:t>CMD_*</w:t>
-            </w:r>
-          </w:p>
-        </w:tc>
-        <w:tc>
-          <w:tcPr>
-            <w:tcW w:type="dxa" w:w="1560"/>
-          </w:tcPr>
-          <w:p>
-            <w:r/>
-            <w:r>
-              <w:rPr>
-                <w:rFonts w:ascii="Consolas" w:hAnsi="Consolas"/>
-                <w:sz w:val="19"/>
-              </w:rPr>
-              <w:t>costura_03_comandos</w:t>
-            </w:r>
-            <w:r>
-              <w:rPr>
-                <w:b w:val="0"/>
-                <w:sz w:val="19"/>
-              </w:rPr>
-              <w:t xml:space="preserve"> (7 chk)</w:t>
-            </w:r>
-          </w:p>
-        </w:tc>
-        <w:tc>
-          <w:tcPr>
-            <w:tcW w:type="dxa" w:w="1560"/>
-          </w:tcPr>
-          <w:p>
-            <w:r/>
-            <w:r>
-              <w:rPr>
-                <w:b w:val="0"/>
-                <w:sz w:val="19"/>
-              </w:rPr>
-              <w:t>⚠️ parcial</w:t>
-            </w:r>
-          </w:p>
-        </w:tc>
-      </w:tr>
-      <w:tr>
-        <w:tc>
-          <w:tcPr>
-            <w:tcW w:type="dxa" w:w="1560"/>
-          </w:tcPr>
-          <w:p>
-            <w:r/>
-            <w:r>
-              <w:rPr>
-                <w:b w:val="0"/>
-                <w:sz w:val="19"/>
-              </w:rPr>
-              <w:t>6</w:t>
-            </w:r>
-          </w:p>
-        </w:tc>
-        <w:tc>
-          <w:tcPr>
-            <w:tcW w:type="dxa" w:w="1560"/>
-          </w:tcPr>
-          <w:p>
-            <w:r/>
-            <w:r>
-              <w:rPr>
-                <w:b w:val="0"/>
-                <w:sz w:val="19"/>
-              </w:rPr>
-              <w:t>Bluetooth Maestro</w:t>
-            </w:r>
-          </w:p>
-        </w:tc>
-        <w:tc>
-          <w:tcPr>
-            <w:tcW w:type="dxa" w:w="1560"/>
-          </w:tcPr>
-          <w:p>
-            <w:r/>
-            <w:r>
-              <w:rPr>
-                <w:rFonts w:ascii="Consolas" w:hAnsi="Consolas"/>
-                <w:sz w:val="19"/>
-              </w:rPr>
-              <w:t>USART1</w:t>
-            </w:r>
-          </w:p>
-        </w:tc>
-        <w:tc>
-          <w:tcPr>
-            <w:tcW w:type="dxa" w:w="1560"/>
-          </w:tcPr>
-          <w:p>
-            <w:r/>
-            <w:r>
-              <w:rPr>
-                <w:b w:val="0"/>
-                <w:sz w:val="19"/>
-              </w:rPr>
-              <w:t>7 comandos</w:t>
-            </w:r>
-          </w:p>
-        </w:tc>
-        <w:tc>
-          <w:tcPr>
-            <w:tcW w:type="dxa" w:w="1560"/>
-          </w:tcPr>
-          <w:p>
-            <w:r/>
-            <w:r>
-              <w:rPr>
-                <w:b/>
-                <w:sz w:val="19"/>
-              </w:rPr>
-              <w:t>ninguno</w:t>
-            </w:r>
-          </w:p>
-        </w:tc>
-        <w:tc>
-          <w:tcPr>
-            <w:tcW w:type="dxa" w:w="1560"/>
-          </w:tcPr>
-          <w:p>
-            <w:r/>
-            <w:r>
-              <w:rPr>
-                <w:b w:val="0"/>
-                <w:sz w:val="19"/>
-              </w:rPr>
-              <w:t>❌</w:t>
-            </w:r>
-          </w:p>
-        </w:tc>
-      </w:tr>
-      <w:tr>
-        <w:tc>
-          <w:tcPr>
-            <w:tcW w:type="dxa" w:w="1560"/>
-          </w:tcPr>
-          <w:p>
-            <w:r/>
-            <w:r>
-              <w:rPr>
-                <w:b w:val="0"/>
-                <w:sz w:val="19"/>
-              </w:rPr>
-              <w:t>7</w:t>
-            </w:r>
-          </w:p>
-        </w:tc>
-        <w:tc>
-          <w:tcPr>
-            <w:tcW w:type="dxa" w:w="1560"/>
-          </w:tcPr>
-          <w:p>
-            <w:r/>
-            <w:r>
-              <w:rPr>
-                <w:b w:val="0"/>
-                <w:sz w:val="19"/>
-              </w:rPr>
-              <w:t>Bluetooth Esclavo</w:t>
-            </w:r>
-          </w:p>
-        </w:tc>
-        <w:tc>
-          <w:tcPr>
-            <w:tcW w:type="dxa" w:w="1560"/>
-          </w:tcPr>
-          <w:p>
-            <w:r/>
-            <w:r>
-              <w:rPr>
-                <w:rFonts w:ascii="Consolas" w:hAnsi="Consolas"/>
-                <w:sz w:val="19"/>
-              </w:rPr>
-              <w:t>USART1</w:t>
-            </w:r>
-          </w:p>
-        </w:tc>
-        <w:tc>
-          <w:tcPr>
-            <w:tcW w:type="dxa" w:w="1560"/>
-          </w:tcPr>
-          <w:p>
-            <w:r/>
-            <w:r>
-              <w:rPr>
-                <w:b w:val="0"/>
-                <w:sz w:val="19"/>
-              </w:rPr>
-              <w:t>3 comandos</w:t>
-            </w:r>
-          </w:p>
-        </w:tc>
-        <w:tc>
-          <w:tcPr>
-            <w:tcW w:type="dxa" w:w="1560"/>
-          </w:tcPr>
-          <w:p>
-            <w:r/>
-            <w:r>
-              <w:rPr>
-                <w:b/>
-                <w:sz w:val="19"/>
-              </w:rPr>
-              <w:t>ninguno</w:t>
-            </w:r>
-          </w:p>
-        </w:tc>
-        <w:tc>
-          <w:tcPr>
-            <w:tcW w:type="dxa" w:w="1560"/>
-          </w:tcPr>
-          <w:p>
-            <w:r/>
-            <w:r>
-              <w:rPr>
-                <w:b w:val="0"/>
-                <w:sz w:val="19"/>
-              </w:rPr>
-              <w:t>❌</w:t>
-            </w:r>
-          </w:p>
-        </w:tc>
-      </w:tr>
-      <w:tr>
-        <w:tc>
-          <w:tcPr>
-            <w:tcW w:type="dxa" w:w="1560"/>
-          </w:tcPr>
-          <w:p>
-            <w:r/>
-            <w:r>
-              <w:rPr>
-                <w:b w:val="0"/>
-                <w:sz w:val="19"/>
-              </w:rPr>
-              <w:t>8</w:t>
-            </w:r>
-          </w:p>
-        </w:tc>
-        <w:tc>
-          <w:tcPr>
-            <w:tcW w:type="dxa" w:w="1560"/>
-          </w:tcPr>
-          <w:p>
-            <w:r/>
-            <w:r>
-              <w:rPr>
-                <w:b w:val="0"/>
-                <w:sz w:val="19"/>
-              </w:rPr>
-              <w:t>Respaldo en pila</w:t>
-            </w:r>
-          </w:p>
-        </w:tc>
-        <w:tc>
-          <w:tcPr>
-            <w:tcW w:type="dxa" w:w="1560"/>
-          </w:tcPr>
-          <w:p>
-            <w:r/>
-            <w:r>
-              <w:rPr>
-                <w:b w:val="0"/>
-                <w:sz w:val="19"/>
-              </w:rPr>
-              <w:t>BKP RAM</w:t>
-            </w:r>
-          </w:p>
-        </w:tc>
-        <w:tc>
-          <w:tcPr>
-            <w:tcW w:type="dxa" w:w="1560"/>
-          </w:tcPr>
-          <w:p>
-            <w:r/>
-            <w:r>
-              <w:rPr>
-                <w:b w:val="0"/>
-                <w:sz w:val="19"/>
-              </w:rPr>
-              <w:t>firma + checksum</w:t>
-            </w:r>
-          </w:p>
-        </w:tc>
-        <w:tc>
-          <w:tcPr>
-            <w:tcW w:type="dxa" w:w="1560"/>
-          </w:tcPr>
-          <w:p>
-            <w:r/>
-            <w:r>
-              <w:rPr>
-                <w:rFonts w:ascii="Consolas" w:hAnsi="Consolas"/>
-                <w:sz w:val="19"/>
-              </w:rPr>
-              <w:t>maestro_02_respaldo</w:t>
-            </w:r>
-            <w:r>
-              <w:rPr>
-                <w:b w:val="0"/>
-                <w:sz w:val="19"/>
-              </w:rPr>
-              <w:t xml:space="preserve"> (19)</w:t>
-            </w:r>
-          </w:p>
-        </w:tc>
-        <w:tc>
-          <w:tcPr>
-            <w:tcW w:type="dxa" w:w="1560"/>
-          </w:tcPr>
-          <w:p>
-            <w:r/>
-            <w:r>
-              <w:rPr>
-                <w:b w:val="0"/>
-                <w:sz w:val="19"/>
-              </w:rPr>
-              <w:t>✅</w:t>
-            </w:r>
-          </w:p>
-        </w:tc>
-      </w:tr>
-      <w:tr>
-        <w:tc>
-          <w:tcPr>
-            <w:tcW w:type="dxa" w:w="1560"/>
-          </w:tcPr>
-          <w:p>
-            <w:r/>
-            <w:r>
-              <w:rPr>
-                <w:b w:val="0"/>
-                <w:sz w:val="19"/>
-              </w:rPr>
-              <w:t>9</w:t>
-            </w:r>
-          </w:p>
-        </w:tc>
-        <w:tc>
-          <w:tcPr>
-            <w:tcW w:type="dxa" w:w="1560"/>
-          </w:tcPr>
-          <w:p>
-            <w:r/>
-            <w:r>
-              <w:rPr>
-                <w:b w:val="0"/>
-                <w:sz w:val="19"/>
-              </w:rPr>
-              <w:t>Reloj / pila</w:t>
-            </w:r>
-          </w:p>
-        </w:tc>
-        <w:tc>
-          <w:tcPr>
-            <w:tcW w:type="dxa" w:w="1560"/>
-          </w:tcPr>
-          <w:p>
-            <w:r/>
-            <w:r>
-              <w:rPr>
-                <w:b w:val="0"/>
-                <w:sz w:val="19"/>
-              </w:rPr>
-              <w:t>RTC</w:t>
-            </w:r>
-          </w:p>
-        </w:tc>
-        <w:tc>
-          <w:tcPr>
-            <w:tcW w:type="dxa" w:w="1560"/>
-          </w:tcPr>
-          <w:p>
-            <w:r/>
-            <w:r>
-              <w:rPr>
-                <w:b w:val="0"/>
-                <w:sz w:val="19"/>
-              </w:rPr>
-              <w:t>hora, validez</w:t>
-            </w:r>
-          </w:p>
-        </w:tc>
-        <w:tc>
-          <w:tcPr>
-            <w:tcW w:type="dxa" w:w="1560"/>
-          </w:tcPr>
-          <w:p>
-            <w:r/>
-            <w:r>
-              <w:rPr>
-                <w:rFonts w:ascii="Consolas" w:hAnsi="Consolas"/>
-                <w:sz w:val="19"/>
-              </w:rPr>
-              <w:t>maestro_04_sync_horaria</w:t>
-            </w:r>
-            <w:r>
-              <w:rPr>
-                <w:b w:val="0"/>
-                <w:sz w:val="19"/>
-              </w:rPr>
-              <w:t xml:space="preserve"> (11), </w:t>
-            </w:r>
-            <w:r>
-              <w:rPr>
-                <w:rFonts w:ascii="Consolas" w:hAnsi="Consolas"/>
-                <w:sz w:val="19"/>
-              </w:rPr>
-              <w:t>esclavo_05_hora_atomica</w:t>
-            </w:r>
-            <w:r>
-              <w:rPr>
-                <w:b w:val="0"/>
-                <w:sz w:val="19"/>
-              </w:rPr>
-              <w:t xml:space="preserve"> (7)</w:t>
-            </w:r>
-          </w:p>
-        </w:tc>
-        <w:tc>
-          <w:tcPr>
-            <w:tcW w:type="dxa" w:w="1560"/>
-          </w:tcPr>
-          <w:p>
-            <w:r/>
-            <w:r>
-              <w:rPr>
-                <w:b w:val="0"/>
-                <w:sz w:val="19"/>
-              </w:rPr>
-              <w:t>✅</w:t>
-            </w:r>
-          </w:p>
-        </w:tc>
-      </w:tr>
-      <w:tr>
-        <w:tc>
-          <w:tcPr>
-            <w:tcW w:type="dxa" w:w="1560"/>
-          </w:tcPr>
-          <w:p>
-            <w:r/>
-            <w:r>
-              <w:rPr>
-                <w:b w:val="0"/>
-                <w:sz w:val="19"/>
-              </w:rPr>
-              <w:t>10</w:t>
-            </w:r>
-          </w:p>
-        </w:tc>
-        <w:tc>
-          <w:tcPr>
-            <w:tcW w:type="dxa" w:w="1560"/>
-          </w:tcPr>
-          <w:p>
-            <w:r/>
-            <w:r>
-              <w:rPr>
-                <w:b w:val="0"/>
-                <w:sz w:val="19"/>
-              </w:rPr>
-              <w:t>Corte de energía</w:t>
-            </w:r>
-          </w:p>
-        </w:tc>
-        <w:tc>
-          <w:tcPr>
-            <w:tcW w:type="dxa" w:w="1560"/>
-          </w:tcPr>
-          <w:p>
-            <w:r/>
-            <w:r>
-              <w:rPr>
-                <w:b w:val="0"/>
-                <w:sz w:val="19"/>
-              </w:rPr>
-              <w:t>—</w:t>
-            </w:r>
-          </w:p>
-        </w:tc>
-        <w:tc>
-          <w:tcPr>
-            <w:tcW w:type="dxa" w:w="1560"/>
-          </w:tcPr>
-          <w:p>
-            <w:r/>
-            <w:r>
-              <w:rPr>
-                <w:b w:val="0"/>
-                <w:sz w:val="19"/>
-              </w:rPr>
-              <w:t>reanudación</w:t>
-            </w:r>
-          </w:p>
-        </w:tc>
-        <w:tc>
-          <w:tcPr>
-            <w:tcW w:type="dxa" w:w="1560"/>
-          </w:tcPr>
-          <w:p>
-            <w:r/>
-            <w:r>
-              <w:rPr>
-                <w:rFonts w:ascii="Consolas" w:hAnsi="Consolas"/>
-                <w:sz w:val="19"/>
-              </w:rPr>
-              <w:t>costura_06_reanudacion</w:t>
-            </w:r>
-            <w:r>
-              <w:rPr>
-                <w:b w:val="0"/>
-                <w:sz w:val="19"/>
-              </w:rPr>
-              <w:t xml:space="preserve"> (9)</w:t>
-            </w:r>
-          </w:p>
-        </w:tc>
-        <w:tc>
-          <w:tcPr>
-            <w:tcW w:type="dxa" w:w="1560"/>
-          </w:tcPr>
-          <w:p>
-            <w:r/>
-            <w:r>
-              <w:rPr>
-                <w:b w:val="0"/>
-                <w:sz w:val="19"/>
-              </w:rPr>
-              <w:t>✅</w:t>
-            </w:r>
-          </w:p>
-        </w:tc>
-      </w:tr>
-    </w:tbl>
-    <w:p>
-      <w:pPr>
-        <w:spacing w:after="120"/>
-      </w:pPr>
     </w:p>
     <w:p>
       <w:pPr>
@@ -1611,91 +576,7 @@
           <w:b/>
           <w:sz w:val="21"/>
         </w:rPr>
-        <w:t>El patrón salta a la vista: todo lo anterior a V9.0 está cubierto; todo lo que V9.0 añadió, no.</w:t>
-      </w:r>
-    </w:p>
-    <w:p>
-      <w:pPr>
-        <w:spacing w:after="120"/>
-      </w:pPr>
-      <w:r>
-        <w:rPr>
-          <w:b w:val="0"/>
-          <w:sz w:val="21"/>
-        </w:rPr>
-        <w:t xml:space="preserve">Los 20 packs suman </w:t>
-      </w:r>
-      <w:r>
-        <w:rPr>
-          <w:rFonts w:ascii="Consolas" w:hAnsi="Consolas"/>
-          <w:sz w:val="21"/>
-        </w:rPr>
-        <w:t>155/155</w:t>
-      </w:r>
-      <w:r>
-        <w:rPr>
-          <w:b w:val="0"/>
-          <w:sz w:val="21"/>
-        </w:rPr>
-        <w:t xml:space="preserve"> — exactamente los mismos que antes del Bluetooth, las cámaras y los dos</w:t>
-      </w:r>
-    </w:p>
-    <w:p>
-      <w:pPr>
-        <w:spacing w:after="120"/>
-      </w:pPr>
-      <w:r>
-        <w:rPr>
-          <w:b w:val="0"/>
-          <w:sz w:val="21"/>
-        </w:rPr>
-        <w:t>comandos de radio nuevos.</w:t>
-      </w:r>
-    </w:p>
-    <w:p>
-      <w:pPr>
-        <w:spacing w:before="200" w:after="120"/>
-      </w:pPr>
-      <w:r>
-        <w:rPr>
-          <w:b/>
-          <w:color w:val="003366"/>
-          <w:sz w:val="23"/>
-        </w:rPr>
-        <w:t>2.bis Los comandos de radio, uno a uno</w:t>
-      </w:r>
-    </w:p>
-    <w:p>
-      <w:pPr>
-        <w:spacing w:after="120"/>
-      </w:pPr>
-      <w:r>
-        <w:rPr>
-          <w:rFonts w:ascii="Consolas" w:hAnsi="Consolas"/>
-          <w:sz w:val="21"/>
-        </w:rPr>
-        <w:t>protocolo.h</w:t>
-      </w:r>
-      <w:r>
-        <w:rPr>
-          <w:b w:val="0"/>
-          <w:sz w:val="21"/>
-        </w:rPr>
-        <w:t xml:space="preserve"> define 18. </w:t>
-      </w:r>
-      <w:r>
-        <w:rPr>
-          <w:rFonts w:ascii="Consolas" w:hAnsi="Consolas"/>
-          <w:sz w:val="21"/>
-        </w:rPr>
-        <w:t>costura_03_comandos.py</w:t>
-      </w:r>
-      <w:r>
-        <w:rPr>
-          <w:b w:val="0"/>
-          <w:sz w:val="21"/>
-        </w:rPr>
-        <w:t xml:space="preserve"> no se toca desde la Fase 2:</w:t>
+        <w:t>MEDIDO el 31/08 — el censo que lo cierra:</w:t>
       </w:r>
     </w:p>
     <w:p>
@@ -1709,1370 +590,21 @@
           <w:rFonts w:ascii="Consolas" w:hAnsi="Consolas"/>
           <w:sz w:val="18"/>
         </w:rPr>
-        <w:t>CMD_GO_GREEN  CMD_GO_RED  CMD_ACK_GREEN  CMD_PING  CMD_PONG  CMD_ACK_RED</w:t>
+        <w:t>$ grep -rn "CAM_UMBRAL_PIN" --include=*.cpp --include=*.h Maestro Esclavo</w:t>
         <w:br/>
-        <w:t>CMD_HORA_D  CMD_HORA_H  CMD_HORA_M  CMD_HORA_S  CMD_ACK_HORA</w:t>
+        <w:t xml:space="preserve">   (sin resultados)</w:t>
         <w:br/>
-        <w:t>CMD_DELTA  CMD_DELTA_RESP  CMD_CONFIG_VERDE  CMD_CONFIG_DESPEJE  CMD_ACK_CONFIG</w:t>
         <w:br/>
-        <w:t>CMD_DEMANDA  CMD_ACK_DEMANDA          &lt;- los dos nuevos, sin cubrir</w:t>
-      </w:r>
-    </w:p>
-    <w:p>
-      <w:pPr>
-        <w:spacing w:after="80"/>
-      </w:pPr>
-    </w:p>
-    <w:p>
-      <w:pPr>
-        <w:spacing w:before="280" w:after="120"/>
-      </w:pPr>
-      <w:r>
-        <w:rPr>
-          <w:b/>
-          <w:color w:val="003366"/>
-          <w:sz w:val="26"/>
-        </w:rPr>
-        <w:t>3. Invariantes de seguridad, y quién intenta romperlos</w:t>
-      </w:r>
-    </w:p>
-    <w:p>
-      <w:pPr>
-        <w:spacing w:after="120"/>
-      </w:pPr>
-      <w:r>
-        <w:rPr>
-          <w:b w:val="0"/>
-          <w:sz w:val="21"/>
-        </w:rPr>
-        <w:t xml:space="preserve">Un invariante sin una prueba que </w:t>
-      </w:r>
-      <w:r>
-        <w:rPr>
-          <w:b/>
-          <w:sz w:val="21"/>
-        </w:rPr>
-        <w:t>intente violarlo</w:t>
-      </w:r>
-      <w:r>
-        <w:rPr>
-          <w:b w:val="0"/>
-          <w:sz w:val="21"/>
-        </w:rPr>
-        <w:t xml:space="preserve"> es una intención, no una garantía.</w:t>
-      </w:r>
-    </w:p>
-    <w:tbl>
-      <w:tblPr>
-        <w:tblStyle w:val="TableGrid"/>
-        <w:tblW w:type="auto" w:w="0"/>
-        <w:tblLook w:firstColumn="1" w:firstRow="1" w:lastColumn="0" w:lastRow="0" w:noHBand="0" w:noVBand="1" w:val="04A0"/>
-      </w:tblPr>
-      <w:tblGrid>
-        <w:gridCol w:w="4680"/>
-        <w:gridCol w:w="4680"/>
-      </w:tblGrid>
-      <w:tr>
-        <w:tc>
-          <w:tcPr>
-            <w:tcW w:type="dxa" w:w="4680"/>
-            <w:shd w:val="clear" w:fill="DCE6F1"/>
-          </w:tcPr>
-          <w:p>
-            <w:r/>
-            <w:r>
-              <w:rPr>
-                <w:b/>
-                <w:sz w:val="19"/>
-              </w:rPr>
-              <w:t>Invariante</w:t>
-            </w:r>
-          </w:p>
-        </w:tc>
-        <w:tc>
-          <w:tcPr>
-            <w:tcW w:type="dxa" w:w="4680"/>
-            <w:shd w:val="clear" w:fill="DCE6F1"/>
-          </w:tcPr>
-          <w:p>
-            <w:r/>
-            <w:r>
-              <w:rPr>
-                <w:b/>
-                <w:sz w:val="19"/>
-              </w:rPr>
-              <w:t>¿Quién lo intenta romper?</w:t>
-            </w:r>
-          </w:p>
-        </w:tc>
-      </w:tr>
-      <w:tr>
-        <w:tc>
-          <w:tcPr>
-            <w:tcW w:type="dxa" w:w="4680"/>
-          </w:tcPr>
-          <w:p>
-            <w:r/>
-            <w:r>
-              <w:rPr>
-                <w:b w:val="0"/>
-                <w:sz w:val="19"/>
-              </w:rPr>
-              <w:t xml:space="preserve">Ningún pin de luz se escribe fuera de </w:t>
-            </w:r>
-            <w:r>
-              <w:rPr>
-                <w:rFonts w:ascii="Consolas" w:hAnsi="Consolas"/>
-                <w:sz w:val="19"/>
-              </w:rPr>
-              <w:t>semaforo.cpp</w:t>
-            </w:r>
-          </w:p>
-        </w:tc>
-        <w:tc>
-          <w:tcPr>
-            <w:tcW w:type="dxa" w:w="4680"/>
-          </w:tcPr>
-          <w:p>
-            <w:r/>
-            <w:r>
-              <w:rPr>
-                <w:rFonts w:ascii="Consolas" w:hAnsi="Consolas"/>
-                <w:sz w:val="19"/>
-              </w:rPr>
-              <w:t>barrera_01_pines_de_luz</w:t>
-            </w:r>
-            <w:r>
-              <w:rPr>
-                <w:b w:val="0"/>
-                <w:sz w:val="19"/>
-              </w:rPr>
-              <w:t xml:space="preserve"> ✅</w:t>
-            </w:r>
-          </w:p>
-        </w:tc>
-      </w:tr>
-      <w:tr>
-        <w:tc>
-          <w:tcPr>
-            <w:tcW w:type="dxa" w:w="4680"/>
-          </w:tcPr>
-          <w:p>
-            <w:r/>
-            <w:r>
-              <w:rPr>
-                <w:b w:val="0"/>
-                <w:sz w:val="19"/>
-              </w:rPr>
-              <w:t>Nunca verde y rojo a la vez en la misma cabeza (SFTY-2)</w:t>
-            </w:r>
-          </w:p>
-        </w:tc>
-        <w:tc>
-          <w:tcPr>
-            <w:tcW w:type="dxa" w:w="4680"/>
-          </w:tcPr>
-          <w:p>
-            <w:r/>
-            <w:r>
-              <w:rPr>
-                <w:rFonts w:ascii="Consolas" w:hAnsi="Consolas"/>
-                <w:sz w:val="19"/>
-              </w:rPr>
-              <w:t>Validacion_Automatico</w:t>
-            </w:r>
-            <w:r>
-              <w:rPr>
-                <w:b w:val="0"/>
-                <w:sz w:val="19"/>
-              </w:rPr>
-              <w:t>, sobre pines escritos ✅</w:t>
-            </w:r>
-          </w:p>
-        </w:tc>
-      </w:tr>
-      <w:tr>
-        <w:tc>
-          <w:tcPr>
-            <w:tcW w:type="dxa" w:w="4680"/>
-          </w:tcPr>
-          <w:p>
-            <w:r/>
-            <w:r>
-              <w:rPr>
-                <w:b/>
-                <w:sz w:val="19"/>
-              </w:rPr>
-              <w:t>Nunca verde simultáneo en las DOS puntas</w:t>
-            </w:r>
-          </w:p>
-        </w:tc>
-        <w:tc>
-          <w:tcPr>
-            <w:tcW w:type="dxa" w:w="4680"/>
-          </w:tcPr>
-          <w:p>
-            <w:r/>
-            <w:r>
-              <w:rPr>
-                <w:b w:val="0"/>
-                <w:sz w:val="19"/>
-              </w:rPr>
-              <w:t xml:space="preserve">🔴 </w:t>
-            </w:r>
-            <w:r>
-              <w:rPr>
-                <w:b/>
-                <w:sz w:val="19"/>
-              </w:rPr>
-              <w:t>nadie.</w:t>
-            </w:r>
-            <w:r>
-              <w:rPr>
-                <w:b w:val="0"/>
-                <w:sz w:val="19"/>
-              </w:rPr>
-              <w:t xml:space="preserve"> </w:t>
-            </w:r>
-            <w:r>
-              <w:rPr>
-                <w:rFonts w:ascii="Consolas" w:hAnsi="Consolas"/>
-                <w:sz w:val="19"/>
-              </w:rPr>
-              <w:t>Validacion_Automatico</w:t>
-            </w:r>
-            <w:r>
-              <w:rPr>
-                <w:b w:val="0"/>
-                <w:sz w:val="19"/>
-              </w:rPr>
-              <w:t xml:space="preserve"> solo compila el Maestro</w:t>
-            </w:r>
-          </w:p>
-        </w:tc>
-      </w:tr>
-      <w:tr>
-        <w:tc>
-          <w:tcPr>
-            <w:tcW w:type="dxa" w:w="4680"/>
-          </w:tcPr>
-          <w:p>
-            <w:r/>
-            <w:r>
-              <w:rPr>
-                <w:b w:val="0"/>
-                <w:sz w:val="19"/>
-              </w:rPr>
-              <w:t>El despeje nunca baja del configurado</w:t>
-            </w:r>
-          </w:p>
-        </w:tc>
-        <w:tc>
-          <w:tcPr>
-            <w:tcW w:type="dxa" w:w="4680"/>
-          </w:tcPr>
-          <w:p>
-            <w:r/>
-            <w:r>
-              <w:rPr>
-                <w:b w:val="0"/>
-                <w:sz w:val="19"/>
-              </w:rPr>
-              <w:t xml:space="preserve">⚠️ indirecto en </w:t>
-            </w:r>
-            <w:r>
-              <w:rPr>
-                <w:rFonts w:ascii="Consolas" w:hAnsi="Consolas"/>
-                <w:sz w:val="19"/>
-              </w:rPr>
-              <w:t>costura_02</w:t>
-            </w:r>
-          </w:p>
-        </w:tc>
-      </w:tr>
-      <w:tr>
-        <w:tc>
-          <w:tcPr>
-            <w:tcW w:type="dxa" w:w="4680"/>
-          </w:tcPr>
-          <w:p>
-            <w:r/>
-            <w:r>
-              <w:rPr>
-                <w:b w:val="0"/>
-                <w:sz w:val="19"/>
-              </w:rPr>
-              <w:t>No se reanuda el Degradado sin autorización válida</w:t>
-            </w:r>
-          </w:p>
-        </w:tc>
-        <w:tc>
-          <w:tcPr>
-            <w:tcW w:type="dxa" w:w="4680"/>
-          </w:tcPr>
-          <w:p>
-            <w:r/>
-            <w:r>
-              <w:rPr>
-                <w:rFonts w:ascii="Consolas" w:hAnsi="Consolas"/>
-                <w:sz w:val="19"/>
-              </w:rPr>
-              <w:t>costura_06</w:t>
-            </w:r>
-            <w:r>
-              <w:rPr>
-                <w:b w:val="0"/>
-                <w:sz w:val="19"/>
-              </w:rPr>
-              <w:t xml:space="preserve">, </w:t>
-            </w:r>
-            <w:r>
-              <w:rPr>
-                <w:rFonts w:ascii="Consolas" w:hAnsi="Consolas"/>
-                <w:sz w:val="19"/>
-              </w:rPr>
-              <w:t>maestro_03_puerta_degradado</w:t>
-            </w:r>
-            <w:r>
-              <w:rPr>
-                <w:b w:val="0"/>
-                <w:sz w:val="19"/>
-              </w:rPr>
-              <w:t xml:space="preserve"> ✅</w:t>
-            </w:r>
-          </w:p>
-        </w:tc>
-      </w:tr>
-      <w:tr>
-        <w:tc>
-          <w:tcPr>
-            <w:tcW w:type="dxa" w:w="4680"/>
-          </w:tcPr>
-          <w:p>
-            <w:r/>
-            <w:r>
-              <w:rPr>
-                <w:b w:val="0"/>
-                <w:sz w:val="19"/>
-              </w:rPr>
-              <w:t>Un equipo sin hora no autoriza el Degradado</w:t>
-            </w:r>
-          </w:p>
-        </w:tc>
-        <w:tc>
-          <w:tcPr>
-            <w:tcW w:type="dxa" w:w="4680"/>
-          </w:tcPr>
-          <w:p>
-            <w:r/>
-            <w:r>
-              <w:rPr>
-                <w:rFonts w:ascii="Consolas" w:hAnsi="Consolas"/>
-                <w:sz w:val="19"/>
-              </w:rPr>
-              <w:t>maestro_04</w:t>
-            </w:r>
-            <w:r>
-              <w:rPr>
-                <w:b w:val="0"/>
-                <w:sz w:val="19"/>
-              </w:rPr>
-              <w:t xml:space="preserve">, </w:t>
-            </w:r>
-            <w:r>
-              <w:rPr>
-                <w:rFonts w:ascii="Consolas" w:hAnsi="Consolas"/>
-                <w:sz w:val="19"/>
-              </w:rPr>
-              <w:t>esclavo_05</w:t>
-            </w:r>
-            <w:r>
-              <w:rPr>
-                <w:b w:val="0"/>
-                <w:sz w:val="19"/>
-              </w:rPr>
-              <w:t xml:space="preserve"> ✅</w:t>
-            </w:r>
-          </w:p>
-        </w:tc>
-      </w:tr>
-      <w:tr>
-        <w:tc>
-          <w:tcPr>
-            <w:tcW w:type="dxa" w:w="4680"/>
-          </w:tcPr>
-          <w:p>
-            <w:r/>
-            <w:r>
-              <w:rPr>
-                <w:b/>
-                <w:sz w:val="19"/>
-              </w:rPr>
-              <w:t>Un comando de Bluetooth no abre paso sin PIN</w:t>
-            </w:r>
-          </w:p>
-        </w:tc>
-        <w:tc>
-          <w:tcPr>
-            <w:tcW w:type="dxa" w:w="4680"/>
-          </w:tcPr>
-          <w:p>
-            <w:r/>
-            <w:r>
-              <w:rPr>
-                <w:b w:val="0"/>
-                <w:sz w:val="19"/>
-              </w:rPr>
-              <w:t xml:space="preserve">🔴 </w:t>
-            </w:r>
-            <w:r>
-              <w:rPr>
-                <w:b/>
-                <w:sz w:val="19"/>
-              </w:rPr>
-              <w:t>nadie</w:t>
-            </w:r>
-          </w:p>
-        </w:tc>
-      </w:tr>
-      <w:tr>
-        <w:tc>
-          <w:tcPr>
-            <w:tcW w:type="dxa" w:w="4680"/>
-          </w:tcPr>
-          <w:p>
-            <w:r/>
-            <w:r>
-              <w:rPr>
-                <w:b/>
-                <w:sz w:val="19"/>
-              </w:rPr>
-              <w:t>Un equipo no obedece a una pareja ajena</w:t>
-            </w:r>
-          </w:p>
-        </w:tc>
-        <w:tc>
-          <w:tcPr>
-            <w:tcW w:type="dxa" w:w="4680"/>
-          </w:tcPr>
-          <w:p>
-            <w:r/>
-            <w:r>
-              <w:rPr>
-                <w:b w:val="0"/>
-                <w:sz w:val="19"/>
-              </w:rPr>
-              <w:t xml:space="preserve">🔴 </w:t>
-            </w:r>
-            <w:r>
-              <w:rPr>
-                <w:b/>
-                <w:sz w:val="19"/>
-              </w:rPr>
-              <w:t>nadie</w:t>
-            </w:r>
-            <w:r>
-              <w:rPr>
-                <w:b w:val="0"/>
-                <w:sz w:val="19"/>
-              </w:rPr>
-              <w:t xml:space="preserve"> — y hoy no hay ni direccionamiento</w:t>
-            </w:r>
-          </w:p>
-        </w:tc>
-      </w:tr>
-    </w:tbl>
-    <w:p>
-      <w:pPr>
-        <w:spacing w:after="120"/>
-      </w:pPr>
-    </w:p>
-    <w:p>
-      <w:pPr>
-        <w:spacing w:after="120"/>
-      </w:pPr>
-      <w:r>
-        <w:rPr>
-          <w:b w:val="0"/>
-          <w:sz w:val="21"/>
-        </w:rPr>
-        <w:t xml:space="preserve">La tercera fila es la que mata, y es la que este repositorio ya sabe que no mide: </w:t>
-      </w:r>
-      <w:r>
-        <w:rPr>
-          <w:rFonts w:ascii="Consolas" w:hAnsi="Consolas"/>
-          <w:sz w:val="21"/>
-        </w:rPr>
-        <w:t>CLAUDE.md §8</w:t>
-      </w:r>
-      <w:r>
-        <w:rPr>
-          <w:b w:val="0"/>
-          <w:sz w:val="21"/>
-        </w:rPr>
-        <w:t xml:space="preserve"> lo</w:t>
-      </w:r>
-    </w:p>
-    <w:p>
-      <w:pPr>
-        <w:spacing w:after="120"/>
-      </w:pPr>
-      <w:r>
-        <w:rPr>
-          <w:b w:val="0"/>
-          <w:sz w:val="21"/>
-        </w:rPr>
-        <w:t>dice del arnés del automático — *"solo el Maestro: verde simultáneo en las dos puntas no se mide</w:t>
-      </w:r>
-    </w:p>
-    <w:p>
-      <w:pPr>
-        <w:spacing w:after="120"/>
-      </w:pPr>
-      <w:r>
-        <w:rPr>
-          <w:b w:val="0"/>
-          <w:sz w:val="21"/>
-        </w:rPr>
-        <w:t>ahí"*.</w:t>
-      </w:r>
-    </w:p>
-    <w:p>
-      <w:pPr>
-        <w:spacing w:after="80"/>
-      </w:pPr>
-    </w:p>
-    <w:p>
-      <w:pPr>
-        <w:spacing w:before="280" w:after="120"/>
-      </w:pPr>
-      <w:r>
-        <w:rPr>
-          <w:b/>
-          <w:color w:val="003366"/>
-          <w:sz w:val="26"/>
-        </w:rPr>
-        <w:t>4. Plan de pruebas — qué escribir, y en qué orden</w:t>
-      </w:r>
-    </w:p>
-    <w:p>
-      <w:pPr>
-        <w:spacing w:after="120"/>
-      </w:pPr>
-      <w:r>
-        <w:rPr>
-          <w:b w:val="0"/>
-          <w:sz w:val="21"/>
-        </w:rPr>
-        <w:t xml:space="preserve">Cada pack se conecta a </w:t>
-      </w:r>
-      <w:r>
-        <w:rPr>
-          <w:rFonts w:ascii="Consolas" w:hAnsi="Consolas"/>
-          <w:sz w:val="21"/>
-        </w:rPr>
-        <w:t>compuerta.py</w:t>
-      </w:r>
-      <w:r>
-        <w:rPr>
-          <w:b w:val="0"/>
-          <w:sz w:val="21"/>
-        </w:rPr>
-        <w:t xml:space="preserve"> </w:t>
-      </w:r>
-      <w:r>
-        <w:rPr>
-          <w:b/>
-          <w:sz w:val="21"/>
-        </w:rPr>
-        <w:t>solo después de haberlo visto fallar</w:t>
-      </w:r>
-      <w:r>
-        <w:rPr>
-          <w:b w:val="0"/>
-          <w:sz w:val="21"/>
-        </w:rPr>
-        <w:t xml:space="preserve"> con un defecto</w:t>
-      </w:r>
-    </w:p>
-    <w:p>
-      <w:pPr>
-        <w:spacing w:after="120"/>
-      </w:pPr>
-      <w:r>
-        <w:rPr>
-          <w:b w:val="0"/>
-          <w:sz w:val="21"/>
-        </w:rPr>
-        <w:t xml:space="preserve">inyectado a propósito en el </w:t>
-      </w:r>
-      <w:r>
-        <w:rPr>
-          <w:rFonts w:ascii="Consolas" w:hAnsi="Consolas"/>
-          <w:sz w:val="21"/>
-        </w:rPr>
-        <w:t>.cpp</w:t>
-      </w:r>
-      <w:r>
-        <w:rPr>
-          <w:b w:val="0"/>
-          <w:sz w:val="21"/>
-        </w:rPr>
-        <w:t xml:space="preserve"> real (</w:t>
-      </w:r>
-      <w:r>
-        <w:rPr>
-          <w:rFonts w:ascii="Consolas" w:hAnsi="Consolas"/>
-          <w:sz w:val="21"/>
-        </w:rPr>
-        <w:t>CLAUDE.md §8.bis</w:t>
-      </w:r>
-      <w:r>
-        <w:rPr>
-          <w:b w:val="0"/>
-          <w:sz w:val="21"/>
-        </w:rPr>
-        <w:t>).</w:t>
-      </w:r>
-    </w:p>
-    <w:tbl>
-      <w:tblPr>
-        <w:tblStyle w:val="TableGrid"/>
-        <w:tblW w:type="auto" w:w="0"/>
-        <w:tblLook w:firstColumn="1" w:firstRow="1" w:lastColumn="0" w:lastRow="0" w:noHBand="0" w:noVBand="1" w:val="04A0"/>
-      </w:tblPr>
-      <w:tblGrid>
-        <w:gridCol w:w="2340"/>
-        <w:gridCol w:w="2340"/>
-        <w:gridCol w:w="2340"/>
-        <w:gridCol w:w="2340"/>
-      </w:tblGrid>
-      <w:tr>
-        <w:tc>
-          <w:tcPr>
-            <w:tcW w:type="dxa" w:w="2340"/>
-            <w:shd w:val="clear" w:fill="DCE6F1"/>
-          </w:tcPr>
-          <w:p>
-            <w:r/>
-            <w:r>
-              <w:rPr>
-                <w:b/>
-                <w:sz w:val="19"/>
-              </w:rPr>
-              <w:t>#</w:t>
-            </w:r>
-          </w:p>
-        </w:tc>
-        <w:tc>
-          <w:tcPr>
-            <w:tcW w:type="dxa" w:w="2340"/>
-            <w:shd w:val="clear" w:fill="DCE6F1"/>
-          </w:tcPr>
-          <w:p>
-            <w:r/>
-            <w:r>
-              <w:rPr>
-                <w:b/>
-                <w:sz w:val="19"/>
-              </w:rPr>
-              <w:t>Pack</w:t>
-            </w:r>
-          </w:p>
-        </w:tc>
-        <w:tc>
-          <w:tcPr>
-            <w:tcW w:type="dxa" w:w="2340"/>
-            <w:shd w:val="clear" w:fill="DCE6F1"/>
-          </w:tcPr>
-          <w:p>
-            <w:r/>
-            <w:r>
-              <w:rPr>
-                <w:b/>
-                <w:sz w:val="19"/>
-              </w:rPr>
-              <w:t>Qué debe romper</w:t>
-            </w:r>
-          </w:p>
-        </w:tc>
-        <w:tc>
-          <w:tcPr>
-            <w:tcW w:type="dxa" w:w="2340"/>
-            <w:shd w:val="clear" w:fill="DCE6F1"/>
-          </w:tcPr>
-          <w:p>
-            <w:r/>
-            <w:r>
-              <w:rPr>
-                <w:b/>
-                <w:sz w:val="19"/>
-              </w:rPr>
-              <w:t>Control negativo obligatorio</w:t>
-            </w:r>
-          </w:p>
-        </w:tc>
-      </w:tr>
-      <w:tr>
-        <w:tc>
-          <w:tcPr>
-            <w:tcW w:type="dxa" w:w="2340"/>
-          </w:tcPr>
-          <w:p>
-            <w:r/>
-            <w:r>
-              <w:rPr>
-                <w:b w:val="0"/>
-                <w:sz w:val="19"/>
-              </w:rPr>
-              <w:t>1</w:t>
-            </w:r>
-          </w:p>
-        </w:tc>
-        <w:tc>
-          <w:tcPr>
-            <w:tcW w:type="dxa" w:w="2340"/>
-          </w:tcPr>
-          <w:p>
-            <w:r/>
-            <w:r>
-              <w:rPr>
-                <w:rFonts w:ascii="Consolas" w:hAnsi="Consolas"/>
-                <w:sz w:val="19"/>
-              </w:rPr>
-              <w:t>bluetooth_01_autorizacion</w:t>
-            </w:r>
-          </w:p>
-        </w:tc>
-        <w:tc>
-          <w:tcPr>
-            <w:tcW w:type="dxa" w:w="2340"/>
-          </w:tcPr>
-          <w:p>
-            <w:r/>
-            <w:r>
-              <w:rPr>
-                <w:b w:val="0"/>
-                <w:sz w:val="19"/>
-              </w:rPr>
-              <w:t>que un comando sin PIN válido abra paso</w:t>
-            </w:r>
-          </w:p>
-        </w:tc>
-        <w:tc>
-          <w:tcPr>
-            <w:tcW w:type="dxa" w:w="2340"/>
-          </w:tcPr>
-          <w:p>
-            <w:r/>
-            <w:r>
-              <w:rPr>
-                <w:b w:val="0"/>
-                <w:sz w:val="19"/>
-              </w:rPr>
-              <w:t>trama sin PIN → debe ser rechazada</w:t>
-            </w:r>
-          </w:p>
-        </w:tc>
-      </w:tr>
-      <w:tr>
-        <w:tc>
-          <w:tcPr>
-            <w:tcW w:type="dxa" w:w="2340"/>
-          </w:tcPr>
-          <w:p>
-            <w:r/>
-            <w:r>
-              <w:rPr>
-                <w:b w:val="0"/>
-                <w:sz w:val="19"/>
-              </w:rPr>
-              <w:t>2</w:t>
-            </w:r>
-          </w:p>
-        </w:tc>
-        <w:tc>
-          <w:tcPr>
-            <w:tcW w:type="dxa" w:w="2340"/>
-          </w:tcPr>
-          <w:p>
-            <w:r/>
-            <w:r>
-              <w:rPr>
-                <w:rFonts w:ascii="Consolas" w:hAnsi="Consolas"/>
-                <w:sz w:val="19"/>
-              </w:rPr>
-              <w:t>bluetooth_02_esclavo_no_abre</w:t>
-            </w:r>
-          </w:p>
-        </w:tc>
-        <w:tc>
-          <w:tcPr>
-            <w:tcW w:type="dxa" w:w="2340"/>
-          </w:tcPr>
-          <w:p>
-            <w:r/>
-            <w:r>
-              <w:rPr>
-                <w:b w:val="0"/>
-                <w:sz w:val="19"/>
-              </w:rPr>
-              <w:t>que el Esclavo ejecute algo que encienda un verde</w:t>
-            </w:r>
-          </w:p>
-        </w:tc>
-        <w:tc>
-          <w:tcPr>
-            <w:tcW w:type="dxa" w:w="2340"/>
-          </w:tcPr>
-          <w:p>
-            <w:r/>
-            <w:r>
-              <w:rPr>
-                <w:rFonts w:ascii="Consolas" w:hAnsi="Consolas"/>
-                <w:sz w:val="19"/>
-              </w:rPr>
-              <w:t>TEST_LEDS</w:t>
-            </w:r>
-            <w:r>
-              <w:rPr>
-                <w:b w:val="0"/>
-                <w:sz w:val="19"/>
-              </w:rPr>
-              <w:t xml:space="preserve"> en servicio → rechazado</w:t>
-            </w:r>
-          </w:p>
-        </w:tc>
-      </w:tr>
-      <w:tr>
-        <w:tc>
-          <w:tcPr>
-            <w:tcW w:type="dxa" w:w="2340"/>
-          </w:tcPr>
-          <w:p>
-            <w:r/>
-            <w:r>
-              <w:rPr>
-                <w:b w:val="0"/>
-                <w:sz w:val="19"/>
-              </w:rPr>
-              <w:t>3</w:t>
-            </w:r>
-          </w:p>
-        </w:tc>
-        <w:tc>
-          <w:tcPr>
-            <w:tcW w:type="dxa" w:w="2340"/>
-          </w:tcPr>
-          <w:p>
-            <w:r/>
-            <w:r>
-              <w:rPr>
-                <w:rFonts w:ascii="Consolas" w:hAnsi="Consolas"/>
-                <w:sz w:val="19"/>
-              </w:rPr>
-              <w:t>costura_08_pareja</w:t>
-            </w:r>
-          </w:p>
-        </w:tc>
-        <w:tc>
-          <w:tcPr>
-            <w:tcW w:type="dxa" w:w="2340"/>
-          </w:tcPr>
-          <w:p>
-            <w:r/>
-            <w:r>
-              <w:rPr>
-                <w:b w:val="0"/>
-                <w:sz w:val="19"/>
-              </w:rPr>
-              <w:t>que un equipo atienda una trama de otra pareja</w:t>
-            </w:r>
-          </w:p>
-        </w:tc>
-        <w:tc>
-          <w:tcPr>
-            <w:tcW w:type="dxa" w:w="2340"/>
-          </w:tcPr>
-          <w:p>
-            <w:r/>
-            <w:r>
-              <w:rPr>
-                <w:rFonts w:ascii="Consolas" w:hAnsi="Consolas"/>
-                <w:sz w:val="19"/>
-              </w:rPr>
-              <w:t>PAIR</w:t>
-            </w:r>
-            <w:r>
-              <w:rPr>
-                <w:b w:val="0"/>
-                <w:sz w:val="19"/>
-              </w:rPr>
-              <w:t xml:space="preserve"> ajeno → descartada</w:t>
-            </w:r>
-          </w:p>
-        </w:tc>
-      </w:tr>
-      <w:tr>
-        <w:tc>
-          <w:tcPr>
-            <w:tcW w:type="dxa" w:w="2340"/>
-          </w:tcPr>
-          <w:p>
-            <w:r/>
-            <w:r>
-              <w:rPr>
-                <w:b w:val="0"/>
-                <w:sz w:val="19"/>
-              </w:rPr>
-              <w:t>4</w:t>
-            </w:r>
-          </w:p>
-        </w:tc>
-        <w:tc>
-          <w:tcPr>
-            <w:tcW w:type="dxa" w:w="2340"/>
-          </w:tcPr>
-          <w:p>
-            <w:r/>
-            <w:r>
-              <w:rPr>
-                <w:rFonts w:ascii="Consolas" w:hAnsi="Consolas"/>
-                <w:sz w:val="19"/>
-              </w:rPr>
-              <w:t>camara_01_demanda</w:t>
-            </w:r>
-          </w:p>
-        </w:tc>
-        <w:tc>
-          <w:tcPr>
-            <w:tcW w:type="dxa" w:w="2340"/>
-          </w:tcPr>
-          <w:p>
-            <w:r/>
-            <w:r>
-              <w:rPr>
-                <w:b w:val="0"/>
-                <w:sz w:val="19"/>
-              </w:rPr>
-              <w:t>antirrebote y que la demanda no acorte el despeje</w:t>
-            </w:r>
-          </w:p>
-        </w:tc>
-        <w:tc>
-          <w:tcPr>
-            <w:tcW w:type="dxa" w:w="2340"/>
-          </w:tcPr>
-          <w:p>
-            <w:r/>
-            <w:r>
-              <w:rPr>
-                <w:b w:val="0"/>
-                <w:sz w:val="19"/>
-              </w:rPr>
-              <w:t xml:space="preserve">demanda continua → el despeje </w:t>
-            </w:r>
-            <w:r>
-              <w:rPr>
-                <w:b/>
-                <w:sz w:val="19"/>
-              </w:rPr>
-              <w:t>no</w:t>
-            </w:r>
-            <w:r>
-              <w:rPr>
-                <w:b w:val="0"/>
-                <w:sz w:val="19"/>
-              </w:rPr>
-              <w:t xml:space="preserve"> baja</w:t>
-            </w:r>
-          </w:p>
-        </w:tc>
-      </w:tr>
-      <w:tr>
-        <w:tc>
-          <w:tcPr>
-            <w:tcW w:type="dxa" w:w="2340"/>
-          </w:tcPr>
-          <w:p>
-            <w:r/>
-            <w:r>
-              <w:rPr>
-                <w:b w:val="0"/>
-                <w:sz w:val="19"/>
-              </w:rPr>
-              <w:t>5</w:t>
-            </w:r>
-          </w:p>
-        </w:tc>
-        <w:tc>
-          <w:tcPr>
-            <w:tcW w:type="dxa" w:w="2340"/>
-          </w:tcPr>
-          <w:p>
-            <w:r/>
-            <w:r>
-              <w:rPr>
-                <w:rFonts w:ascii="Consolas" w:hAnsi="Consolas"/>
-                <w:sz w:val="19"/>
-              </w:rPr>
-              <w:t>costura_03</w:t>
-            </w:r>
-            <w:r>
-              <w:rPr>
-                <w:b w:val="0"/>
-                <w:sz w:val="19"/>
-              </w:rPr>
-              <w:t xml:space="preserve"> (ampliar)</w:t>
-            </w:r>
-          </w:p>
-        </w:tc>
-        <w:tc>
-          <w:tcPr>
-            <w:tcW w:type="dxa" w:w="2340"/>
-          </w:tcPr>
-          <w:p>
-            <w:r/>
-            <w:r>
-              <w:rPr>
-                <w:b w:val="0"/>
-                <w:sz w:val="19"/>
-              </w:rPr>
-              <w:t xml:space="preserve">que </w:t>
-            </w:r>
-            <w:r>
-              <w:rPr>
-                <w:rFonts w:ascii="Consolas" w:hAnsi="Consolas"/>
-                <w:sz w:val="19"/>
-              </w:rPr>
-              <w:t>0x11</w:t>
-            </w:r>
-            <w:r>
-              <w:rPr>
-                <w:b w:val="0"/>
-                <w:sz w:val="19"/>
-              </w:rPr>
-              <w:t>/</w:t>
-            </w:r>
-            <w:r>
-              <w:rPr>
-                <w:rFonts w:ascii="Consolas" w:hAnsi="Consolas"/>
-                <w:sz w:val="19"/>
-              </w:rPr>
-              <w:t>0x12</w:t>
-            </w:r>
-            <w:r>
-              <w:rPr>
-                <w:b w:val="0"/>
-                <w:sz w:val="19"/>
-              </w:rPr>
-              <w:t xml:space="preserve"> cuadren entre las dos puntas</w:t>
-            </w:r>
-          </w:p>
-        </w:tc>
-        <w:tc>
-          <w:tcPr>
-            <w:tcW w:type="dxa" w:w="2340"/>
-          </w:tcPr>
-          <w:p>
-            <w:r/>
-            <w:r>
-              <w:rPr>
-                <w:b w:val="0"/>
-                <w:sz w:val="19"/>
-              </w:rPr>
-              <w:t xml:space="preserve">totales </w:t>
-            </w:r>
-            <w:r>
-              <w:rPr>
-                <w:rFonts w:ascii="Consolas" w:hAnsi="Consolas"/>
-                <w:sz w:val="19"/>
-              </w:rPr>
-              <w:t>7 → 9</w:t>
-            </w:r>
-          </w:p>
-        </w:tc>
-      </w:tr>
-      <w:tr>
-        <w:tc>
-          <w:tcPr>
-            <w:tcW w:type="dxa" w:w="2340"/>
-          </w:tcPr>
-          <w:p>
-            <w:r/>
-            <w:r>
-              <w:rPr>
-                <w:b w:val="0"/>
-                <w:sz w:val="19"/>
-              </w:rPr>
-              <w:t>6</w:t>
-            </w:r>
-          </w:p>
-        </w:tc>
-        <w:tc>
-          <w:tcPr>
-            <w:tcW w:type="dxa" w:w="2340"/>
-          </w:tcPr>
-          <w:p>
-            <w:r/>
-            <w:r>
-              <w:rPr>
-                <w:rFonts w:ascii="Consolas" w:hAnsi="Consolas"/>
-                <w:sz w:val="19"/>
-              </w:rPr>
-              <w:t>barrera_02_dos_puntas</w:t>
-            </w:r>
-          </w:p>
-        </w:tc>
-        <w:tc>
-          <w:tcPr>
-            <w:tcW w:type="dxa" w:w="2340"/>
-          </w:tcPr>
-          <w:p>
-            <w:r/>
-            <w:r>
-              <w:rPr>
-                <w:b/>
-                <w:sz w:val="19"/>
-              </w:rPr>
-              <w:t>verde simultáneo en las dos puntas</w:t>
-            </w:r>
-          </w:p>
-        </w:tc>
-        <w:tc>
-          <w:tcPr>
-            <w:tcW w:type="dxa" w:w="2340"/>
-          </w:tcPr>
-          <w:p>
-            <w:r/>
-            <w:r>
-              <w:rPr>
-                <w:b w:val="0"/>
-                <w:sz w:val="19"/>
-              </w:rPr>
-              <w:t>forzar verde en ambos → debe saltar</w:t>
-            </w:r>
-          </w:p>
-        </w:tc>
-      </w:tr>
-    </w:tbl>
-    <w:p>
-      <w:pPr>
-        <w:spacing w:after="120"/>
-      </w:pPr>
-    </w:p>
-    <w:p>
-      <w:pPr>
-        <w:spacing w:after="120"/>
-      </w:pPr>
-      <w:r>
-        <w:rPr>
-          <w:b w:val="0"/>
-          <w:sz w:val="21"/>
-        </w:rPr>
-        <w:t xml:space="preserve">El </w:t>
-      </w:r>
-      <w:r>
-        <w:rPr>
-          <w:b/>
-          <w:sz w:val="21"/>
-        </w:rPr>
-        <w:t>6</w:t>
-      </w:r>
-      <w:r>
-        <w:rPr>
-          <w:b w:val="0"/>
-          <w:sz w:val="21"/>
-        </w:rPr>
-        <w:t xml:space="preserve"> es el que falta desde siempre y el más caro: exige un arnés que compile los dos firmwares a</w:t>
-      </w:r>
-    </w:p>
-    <w:p>
-      <w:pPr>
-        <w:spacing w:after="120"/>
-      </w:pPr>
-      <w:r>
-        <w:rPr>
-          <w:b w:val="0"/>
-          <w:sz w:val="21"/>
-        </w:rPr>
-        <w:t>la vez. Es también el único que mide la propiedad que puede matar a alguien.</w:t>
-      </w:r>
-    </w:p>
-    <w:p>
-      <w:pPr>
-        <w:spacing w:after="80"/>
-      </w:pPr>
-    </w:p>
-    <w:p>
-      <w:pPr>
-        <w:spacing w:before="280" w:after="120"/>
-      </w:pPr>
-      <w:r>
-        <w:rPr>
-          <w:b/>
-          <w:color w:val="003366"/>
-          <w:sz w:val="26"/>
-        </w:rPr>
-        <w:t>5. Qué NO cubre este documento</w:t>
-      </w:r>
-    </w:p>
-    <w:p>
-      <w:pPr>
-        <w:pStyle w:val="ListBullet"/>
-        <w:spacing w:after="60"/>
-        <w:ind w:left="360"/>
-      </w:pPr>
-      <w:r>
-        <w:rPr>
-          <w:b/>
-          <w:sz w:val="21"/>
-        </w:rPr>
-        <w:t>La app móvil no tiene ninguna prueba</w:t>
-      </w:r>
-      <w:r>
-        <w:rPr>
-          <w:b w:val="0"/>
-          <w:sz w:val="21"/>
-        </w:rPr>
-        <w:t>, de ningún tipo. Ni unitaria, ni de integración.</w:t>
-      </w:r>
-    </w:p>
-    <w:p>
-      <w:pPr>
-        <w:pStyle w:val="ListBullet"/>
-        <w:spacing w:after="60"/>
-        <w:ind w:left="360"/>
-      </w:pPr>
-      <w:r>
-        <w:rPr>
-          <w:b/>
-          <w:sz w:val="21"/>
-        </w:rPr>
-        <w:t>Nada de esto sustituye la prueba de banco.</w:t>
-      </w:r>
-      <w:r>
-        <w:rPr>
-          <w:b w:val="0"/>
-          <w:sz w:val="21"/>
-        </w:rPr>
-        <w:t xml:space="preserve"> Un pack demuestra que el modelo y el código</w:t>
-      </w:r>
-    </w:p>
-    <w:p>
-      <w:pPr>
-        <w:spacing w:after="120"/>
-      </w:pPr>
-      <w:r>
-        <w:rPr>
-          <w:b w:val="0"/>
-          <w:sz w:val="21"/>
-        </w:rPr>
-        <w:t>coinciden; no que la tarjeta encienda una bombilla.</w:t>
-      </w:r>
-    </w:p>
-    <w:p>
-      <w:pPr>
-        <w:spacing w:after="80"/>
-      </w:pPr>
-    </w:p>
-    <w:p>
-      <w:pPr>
-        <w:spacing w:before="280" w:after="120"/>
-      </w:pPr>
-      <w:r>
-        <w:rPr>
-          <w:b/>
-          <w:color w:val="003366"/>
-          <w:sz w:val="26"/>
-        </w:rPr>
-        <w:t xml:space="preserve">6. 🔴🔴 Hallazgo mayor: </w:t>
-      </w:r>
-      <w:r>
-        <w:rPr>
-          <w:rFonts w:ascii="Consolas" w:hAnsi="Consolas"/>
-          <w:color w:val="003366"/>
-          <w:sz w:val="26"/>
-        </w:rPr>
-        <w:t>PB0</w:t>
-      </w:r>
-      <w:r>
-        <w:rPr>
-          <w:b/>
-          <w:color w:val="003366"/>
-          <w:sz w:val="26"/>
-        </w:rPr>
-        <w:t>/</w:t>
-      </w:r>
-      <w:r>
-        <w:rPr>
-          <w:rFonts w:ascii="Consolas" w:hAnsi="Consolas"/>
-          <w:color w:val="003366"/>
-          <w:sz w:val="26"/>
-        </w:rPr>
-        <w:t>PB8</w:t>
-      </w:r>
-      <w:r>
-        <w:rPr>
-          <w:b/>
-          <w:color w:val="003366"/>
-          <w:sz w:val="26"/>
-        </w:rPr>
-        <w:t xml:space="preserve"> están asignados dos veces, y el reloj llegó primero</w:t>
-      </w:r>
-    </w:p>
-    <w:p>
-      <w:pPr>
-        <w:spacing w:after="120"/>
-      </w:pPr>
-      <w:r>
-        <w:rPr>
-          <w:b w:val="0"/>
-          <w:sz w:val="21"/>
-        </w:rPr>
-        <w:t xml:space="preserve">Esta pasada cruzó </w:t>
-      </w:r>
-      <w:r>
-        <w:rPr>
-          <w:b/>
-          <w:sz w:val="21"/>
-        </w:rPr>
-        <w:t>todos</w:t>
-      </w:r>
-      <w:r>
-        <w:rPr>
-          <w:b w:val="0"/>
-          <w:sz w:val="21"/>
-        </w:rPr>
-        <w:t xml:space="preserve"> los documentos que nombran </w:t>
-      </w:r>
-      <w:r>
-        <w:rPr>
-          <w:rFonts w:ascii="Consolas" w:hAnsi="Consolas"/>
-          <w:sz w:val="21"/>
-        </w:rPr>
-        <w:t>PB0</w:t>
-      </w:r>
-      <w:r>
-        <w:rPr>
-          <w:b w:val="0"/>
-          <w:sz w:val="21"/>
-        </w:rPr>
-        <w:t xml:space="preserve"> o </w:t>
-      </w:r>
-      <w:r>
-        <w:rPr>
-          <w:rFonts w:ascii="Consolas" w:hAnsi="Consolas"/>
-          <w:sz w:val="21"/>
-        </w:rPr>
-        <w:t>PB8</w:t>
-      </w:r>
-      <w:r>
-        <w:rPr>
-          <w:b w:val="0"/>
-          <w:sz w:val="21"/>
-        </w:rPr>
-        <w:t>. El resultado no es una errata:</w:t>
+        <w:t>$ grep -rn "PB8" Maestro/include/pines.h Esclavo/include/pines.h</w:t>
+        <w:br/>
+        <w:t xml:space="preserve">   pines.h:63:  #define LED_TESTIGO   PB8   // -&gt; R16 1K -&gt; LED D5. NO es entrada de camara</w:t>
+        <w:br/>
+        <w:br/>
+        <w:t>$ grep -rn "CAM_C_PIN\|CAM_D_PIN" Maestro/include/pines.h</w:t>
+        <w:br/>
+        <w:t xml:space="preserve">   pines.h:124:  #define CAM_C_PIN   PB14   // J16 p10 - camara de contacto seco</w:t>
+        <w:br/>
+        <w:t xml:space="preserve">   pines.h:125:  #define CAM_D_PIN   PB15   // J16 p12 - camara de contacto seco</w:t>
       </w:r>
     </w:p>
     <w:tbl>
@@ -3094,12 +626,21 @@
           </w:tcPr>
           <w:p>
             <w:r/>
+          </w:p>
+        </w:tc>
+        <w:tc>
+          <w:tcPr>
+            <w:tcW w:type="dxa" w:w="3120"/>
+            <w:shd w:val="clear" w:fill="DCE6F1"/>
+          </w:tcPr>
+          <w:p>
+            <w:r/>
             <w:r>
               <w:rPr>
                 <w:b/>
                 <w:sz w:val="19"/>
               </w:rPr>
-              <w:t>Documento</w:t>
+              <w:t>26/08</w:t>
             </w:r>
           </w:p>
         </w:tc>
@@ -3115,51 +656,7 @@
                 <w:b/>
                 <w:sz w:val="19"/>
               </w:rPr>
-              <w:t xml:space="preserve">Dice que </w:t>
-            </w:r>
-            <w:r>
-              <w:rPr>
-                <w:rFonts w:ascii="Consolas" w:hAnsi="Consolas"/>
-                <w:sz w:val="19"/>
-              </w:rPr>
-              <w:t>PB0</w:t>
-            </w:r>
-            <w:r>
-              <w:rPr>
-                <w:b/>
-                <w:sz w:val="19"/>
-              </w:rPr>
-              <w:t>/</w:t>
-            </w:r>
-            <w:r>
-              <w:rPr>
-                <w:rFonts w:ascii="Consolas" w:hAnsi="Consolas"/>
-                <w:sz w:val="19"/>
-              </w:rPr>
-              <w:t>PB8</w:t>
-            </w:r>
-            <w:r>
-              <w:rPr>
-                <w:b/>
-                <w:sz w:val="19"/>
-              </w:rPr>
-              <w:t xml:space="preserve"> son…</w:t>
-            </w:r>
-          </w:p>
-        </w:tc>
-        <w:tc>
-          <w:tcPr>
-            <w:tcW w:type="dxa" w:w="3120"/>
-            <w:shd w:val="clear" w:fill="DCE6F1"/>
-          </w:tcPr>
-          <w:p>
-            <w:r/>
-            <w:r>
-              <w:rPr>
-                <w:b/>
-                <w:sz w:val="19"/>
-              </w:rPr>
-              <w:t>Fecha</w:t>
+              <w:t>31/08</w:t>
             </w:r>
           </w:p>
         </w:tc>
@@ -3176,21 +673,43 @@
                 <w:rFonts w:ascii="Consolas" w:hAnsi="Consolas"/>
                 <w:sz w:val="19"/>
               </w:rPr>
-              <w:t>roadmap.md</w:t>
+              <w:t>PB8</w:t>
+            </w:r>
+          </w:p>
+        </w:tc>
+        <w:tc>
+          <w:tcPr>
+            <w:tcW w:type="dxa" w:w="3120"/>
+          </w:tcPr>
+          <w:p>
+            <w:r/>
+            <w:r>
+              <w:rPr>
+                <w:b w:val="0"/>
+                <w:sz w:val="19"/>
+              </w:rPr>
+              <w:t xml:space="preserve">*«cámara de umbral»* con </w:t>
+            </w:r>
+            <w:r>
+              <w:rPr>
+                <w:rFonts w:ascii="Consolas" w:hAnsi="Consolas"/>
+                <w:sz w:val="19"/>
+              </w:rPr>
+              <w:t>pinMode()</w:t>
             </w:r>
             <w:r>
               <w:rPr>
                 <w:b w:val="0"/>
                 <w:sz w:val="19"/>
               </w:rPr>
-              <w:t xml:space="preserve"> </w:t>
+              <w:t xml:space="preserve"> y sin </w:t>
             </w:r>
             <w:r>
               <w:rPr>
-                <w:b/>
+                <w:rFonts w:ascii="Consolas" w:hAnsi="Consolas"/>
                 <w:sz w:val="19"/>
               </w:rPr>
-              <w:t>N-37</w:t>
+              <w:t>digitalRead()</w:t>
             </w:r>
           </w:p>
         </w:tc>
@@ -3205,29 +724,56 @@
                 <w:b/>
                 <w:sz w:val="19"/>
               </w:rPr>
-              <w:t>`SDA`/`SCL` del `DS3231`</w:t>
+              <w:t>`LED_TESTIGO`</w:t>
             </w:r>
             <w:r>
               <w:rPr>
                 <w:b w:val="0"/>
                 <w:sz w:val="19"/>
               </w:rPr>
-              <w:t xml:space="preserve"> — *"los únicos pines libres"*</w:t>
+              <w:t xml:space="preserve"> — LED </w:t>
             </w:r>
-          </w:p>
-        </w:tc>
-        <w:tc>
-          <w:tcPr>
-            <w:tcW w:type="dxa" w:w="3120"/>
-          </w:tcPr>
-          <w:p>
-            <w:r/>
+            <w:r>
+              <w:rPr>
+                <w:rFonts w:ascii="Consolas" w:hAnsi="Consolas"/>
+                <w:sz w:val="19"/>
+              </w:rPr>
+              <w:t>D5</w:t>
+            </w:r>
+            <w:r>
+              <w:rPr>
+                <w:b w:val="0"/>
+                <w:sz w:val="19"/>
+              </w:rPr>
+              <w:t xml:space="preserve"> por </w:t>
+            </w:r>
+            <w:r>
+              <w:rPr>
+                <w:rFonts w:ascii="Consolas" w:hAnsi="Consolas"/>
+                <w:sz w:val="19"/>
+              </w:rPr>
+              <w:t>R16</w:t>
+            </w:r>
+            <w:r>
+              <w:rPr>
+                <w:b w:val="0"/>
+                <w:sz w:val="19"/>
+              </w:rPr>
+              <w:t xml:space="preserve"> de 1 kΩ. </w:t>
+            </w:r>
             <w:r>
               <w:rPr>
                 <w:b/>
                 <w:sz w:val="19"/>
               </w:rPr>
-              <w:t>cerrado en banco el 01/08/2026</w:t>
+              <w:t>No es entrada</w:t>
+            </w:r>
+            <w:r>
+              <w:rPr>
+                <w:b w:val="0"/>
+                <w:sz w:val="19"/>
+              </w:rPr>
+              <w:t xml:space="preserve"> (N-64)</w:t>
             </w:r>
           </w:p>
         </w:tc>
@@ -3244,57 +790,28 @@
                 <w:b w:val="0"/>
                 <w:sz w:val="19"/>
               </w:rPr>
-              <w:t xml:space="preserve">Manual 11 · </w:t>
+              <w:t xml:space="preserve">Cámaras </w:t>
             </w:r>
             <w:r>
               <w:rPr>
                 <w:rFonts w:ascii="Consolas" w:hAnsi="Consolas"/>
                 <w:sz w:val="19"/>
               </w:rPr>
-              <w:t>MANUAL_INSTALACION_RELOJ_DS3231.md</w:t>
-            </w:r>
-          </w:p>
-        </w:tc>
-        <w:tc>
-          <w:tcPr>
-            <w:tcW w:type="dxa" w:w="3120"/>
-          </w:tcPr>
-          <w:p>
-            <w:r/>
-            <w:r>
-              <w:rPr>
-                <w:rFonts w:ascii="Consolas" w:hAnsi="Consolas"/>
-                <w:sz w:val="19"/>
-              </w:rPr>
-              <w:t>SDA</w:t>
+              <w:t>C</w:t>
             </w:r>
             <w:r>
               <w:rPr>
                 <w:b w:val="0"/>
                 <w:sz w:val="19"/>
               </w:rPr>
-              <w:t>/</w:t>
+              <w:t xml:space="preserve"> y </w:t>
             </w:r>
             <w:r>
               <w:rPr>
                 <w:rFonts w:ascii="Consolas" w:hAnsi="Consolas"/>
                 <w:sz w:val="19"/>
               </w:rPr>
-              <w:t>SCL</w:t>
-            </w:r>
-            <w:r>
-              <w:rPr>
-                <w:b w:val="0"/>
-                <w:sz w:val="19"/>
-              </w:rPr>
-              <w:t xml:space="preserve"> del </w:t>
-            </w:r>
-            <w:r>
-              <w:rPr>
-                <w:rFonts w:ascii="Consolas" w:hAnsi="Consolas"/>
-                <w:sz w:val="19"/>
-              </w:rPr>
-              <w:t>DS3231</w:t>
+              <w:t>D</w:t>
             </w:r>
           </w:p>
         </w:tc>
@@ -3309,7 +826,57 @@
                 <w:b w:val="0"/>
                 <w:sz w:val="19"/>
               </w:rPr>
-              <w:t>V9.0</w:t>
+              <w:t>no existían</w:t>
+            </w:r>
+          </w:p>
+        </w:tc>
+        <w:tc>
+          <w:tcPr>
+            <w:tcW w:type="dxa" w:w="3120"/>
+          </w:tcPr>
+          <w:p>
+            <w:r/>
+            <w:r>
+              <w:rPr>
+                <w:b w:val="0"/>
+                <w:sz w:val="19"/>
+              </w:rPr>
+              <w:t xml:space="preserve">🟢 </w:t>
+            </w:r>
+            <w:r>
+              <w:rPr>
+                <w:b/>
+                <w:sz w:val="19"/>
+              </w:rPr>
+              <w:t>`CAM_C_PIN` = `PB14`, `CAM_D_PIN` = `PB15`</w:t>
+            </w:r>
+            <w:r>
+              <w:rPr>
+                <w:b w:val="0"/>
+                <w:sz w:val="19"/>
+              </w:rPr>
+              <w:t xml:space="preserve">, </w:t>
+            </w:r>
+            <w:r>
+              <w:rPr>
+                <w:rFonts w:ascii="Consolas" w:hAnsi="Consolas"/>
+                <w:sz w:val="19"/>
+              </w:rPr>
+              <w:t>INPUT</w:t>
+            </w:r>
+            <w:r>
+              <w:rPr>
+                <w:b w:val="0"/>
+                <w:sz w:val="19"/>
+              </w:rPr>
+              <w:t xml:space="preserve"> pelado y </w:t>
+            </w:r>
+            <w:r>
+              <w:rPr>
+                <w:b/>
+                <w:sz w:val="19"/>
+              </w:rPr>
+              <w:t>activo en ALTO</w:t>
             </w:r>
           </w:p>
         </w:tc>
@@ -3326,28 +893,22 @@
                 <w:b w:val="0"/>
                 <w:sz w:val="19"/>
               </w:rPr>
-              <w:t xml:space="preserve">Manual 9 · Manual 2 · </w:t>
+              <w:t>Los cuatro documentos que decían *«Umbral de tramo»*</w:t>
             </w:r>
-            <w:r>
-              <w:rPr>
-                <w:rFonts w:ascii="Consolas" w:hAnsi="Consolas"/>
-                <w:sz w:val="19"/>
-              </w:rPr>
-              <w:t>MAPEO:179</w:t>
-            </w:r>
+          </w:p>
+        </w:tc>
+        <w:tc>
+          <w:tcPr>
+            <w:tcW w:type="dxa" w:w="3120"/>
+          </w:tcPr>
+          <w:p>
+            <w:r/>
             <w:r>
               <w:rPr>
                 <w:b w:val="0"/>
                 <w:sz w:val="19"/>
               </w:rPr>
-              <w:t xml:space="preserve"> · </w:t>
-            </w:r>
-            <w:r>
-              <w:rPr>
-                <w:rFonts w:ascii="Consolas" w:hAnsi="Consolas"/>
-                <w:sz w:val="19"/>
-              </w:rPr>
-              <w:t>ESTADO.md</w:t>
+              <w:t>contradecían al fuente</w:t>
             </w:r>
           </w:p>
         </w:tc>
@@ -3362,29 +923,14 @@
                 <w:b/>
                 <w:sz w:val="19"/>
               </w:rPr>
-              <w:t>cámaras IA</w:t>
+              <w:t>caducados</w:t>
             </w:r>
             <w:r>
               <w:rPr>
                 <w:b w:val="0"/>
                 <w:sz w:val="19"/>
               </w:rPr>
-              <w:t xml:space="preserve"> (demanda y umbral)</w:t>
-            </w:r>
-          </w:p>
-        </w:tc>
-        <w:tc>
-          <w:tcPr>
-            <w:tcW w:type="dxa" w:w="3120"/>
-          </w:tcPr>
-          <w:p>
-            <w:r/>
-            <w:r>
-              <w:rPr>
-                <w:b w:val="0"/>
-                <w:sz w:val="19"/>
-              </w:rPr>
-              <w:t>V9.0</w:t>
+              <w:t>: si alguno lo sigue diciendo, está mal</w:t>
             </w:r>
           </w:p>
         </w:tc>
@@ -3401,61 +947,31 @@
       </w:pPr>
       <w:r>
         <w:rPr>
+          <w:b w:val="0"/>
+          <w:sz w:val="21"/>
+        </w:rPr>
+        <w:t xml:space="preserve">⚠️ </w:t>
+      </w:r>
+      <w:r>
+        <w:rPr>
           <w:b/>
           <w:sz w:val="21"/>
         </w:rPr>
-        <w:t>No caben las dos cosas.</w:t>
+        <w:t>Lo que NO está cerrado:</w:t>
       </w:r>
       <w:r>
         <w:rPr>
           <w:b w:val="0"/>
           <w:sz w:val="21"/>
         </w:rPr>
-        <w:t xml:space="preserve"> Y la que llegó primero tiene evidencia de banco detrás.</w:t>
-      </w:r>
-    </w:p>
-    <w:p>
-      <w:pPr>
-        <w:spacing w:before="200" w:after="120"/>
-      </w:pPr>
-      <w:r>
-        <w:rPr>
-          <w:b/>
-          <w:color w:val="003366"/>
-          <w:sz w:val="23"/>
-        </w:rPr>
-        <w:t>Lo que dice N-37, y por qué no es negociable</w:t>
-      </w:r>
-    </w:p>
-    <w:p>
-      <w:pPr>
-        <w:spacing w:after="160"/>
-        <w:ind w:left="360"/>
-        <w:shd w:val="clear" w:fill="FFF4E5"/>
-      </w:pPr>
-      <w:r>
-        <w:rPr>
-          <w:b w:val="0"/>
-          <w:color w:val="960000"/>
-          <w:sz w:val="20"/>
-        </w:rPr>
-        <w:t>*"</w:t>
+        <w:t xml:space="preserve"> el firmware declara los pines, pero **no se cablea cámara a </w:t>
       </w:r>
       <w:r>
         <w:rPr>
-          <w:b/>
-          <w:color w:val="960000"/>
-          <w:sz w:val="20"/>
+          <w:rFonts w:ascii="Consolas" w:hAnsi="Consolas"/>
+          <w:sz w:val="21"/>
         </w:rPr>
-        <w:t>CERRADO POR ELIMINACIÓN: el cristal `Y2` está MUERTO. Banco del 01/08/2026.</w:t>
-      </w:r>
-      <w:r>
-        <w:rPr>
-          <w:b w:val="0"/>
-          <w:color w:val="960000"/>
-          <w:sz w:val="20"/>
-        </w:rPr>
-        <w:t>"*</w:t>
+        <w:t>J16</w:t>
       </w:r>
     </w:p>
     <w:p>
@@ -3467,120 +983,35 @@
           <w:b w:val="0"/>
           <w:sz w:val="21"/>
         </w:rPr>
-        <w:t>Con tres eliminaciones medidas —</w:t>
+        <w:t xml:space="preserve">hasta la medida </w:t>
       </w:r>
       <w:r>
         <w:rPr>
           <w:rFonts w:ascii="Consolas" w:hAnsi="Consolas"/>
           <w:sz w:val="21"/>
         </w:rPr>
-        <w:t>VBAT</w:t>
+        <w:t>M3</w:t>
       </w:r>
       <w:r>
         <w:rPr>
           <w:b w:val="0"/>
           <w:sz w:val="21"/>
         </w:rPr>
-        <w:t xml:space="preserve"> a 3 V con la tarjeta apagada, el reintento de </w:t>
+        <w:t xml:space="preserve">** —con </w:t>
       </w:r>
       <w:r>
         <w:rPr>
           <w:rFonts w:ascii="Consolas" w:hAnsi="Consolas"/>
           <w:sz w:val="21"/>
         </w:rPr>
-        <w:t>N-25</w:t>
+        <w:t>INPUT</w:t>
       </w:r>
       <w:r>
         <w:rPr>
           <w:b w:val="0"/>
           <w:sz w:val="21"/>
         </w:rPr>
-        <w:t>, y</w:t>
-      </w:r>
-    </w:p>
-    <w:p>
-      <w:pPr>
-        <w:spacing w:after="120"/>
-      </w:pPr>
-      <w:r>
-        <w:rPr>
-          <w:rFonts w:ascii="Consolas" w:hAnsi="Consolas"/>
-          <w:sz w:val="21"/>
-        </w:rPr>
-        <w:t>REINICIAR RELOJ</w:t>
-      </w:r>
-      <w:r>
-        <w:rPr>
-          <w:b w:val="0"/>
-          <w:sz w:val="21"/>
-        </w:rPr>
-        <w:t xml:space="preserve"> devolviendo </w:t>
-      </w:r>
-      <w:r>
-        <w:rPr>
-          <w:rFonts w:ascii="Consolas" w:hAnsi="Consolas"/>
-          <w:sz w:val="21"/>
-        </w:rPr>
-        <w:t>SIGUE PARADO</w:t>
-      </w:r>
-      <w:r>
-        <w:rPr>
-          <w:b w:val="0"/>
-          <w:sz w:val="21"/>
-        </w:rPr>
-        <w:t>—. Y su conclusión: *"Ya no queda software que probar.</w:t>
-      </w:r>
-    </w:p>
-    <w:p>
-      <w:pPr>
-        <w:spacing w:after="120"/>
-      </w:pPr>
-      <w:r>
-        <w:rPr>
-          <w:b/>
-          <w:sz w:val="21"/>
-        </w:rPr>
-        <w:t>Salida: `DS3231` por I²C software en `PB0`/`PB8`.</w:t>
-      </w:r>
-      <w:r>
-        <w:rPr>
-          <w:b w:val="0"/>
-          <w:sz w:val="21"/>
-        </w:rPr>
-        <w:t xml:space="preserve"> Hacen falta </w:t>
-      </w:r>
-      <w:r>
-        <w:rPr>
-          <w:b/>
-          <w:sz w:val="21"/>
-        </w:rPr>
-        <w:t>DOS</w:t>
-      </w:r>
-      <w:r>
-        <w:rPr>
-          <w:b w:val="0"/>
-          <w:sz w:val="21"/>
-        </w:rPr>
-        <w:t>"*.</w:t>
-      </w:r>
-    </w:p>
-    <w:p>
-      <w:pPr>
-        <w:spacing w:after="120"/>
-      </w:pPr>
-      <w:r>
-        <w:rPr>
-          <w:b/>
-          <w:sz w:val="21"/>
-        </w:rPr>
-        <w:t>El `MAPEO §4` dice lo contrario</w:t>
-      </w:r>
-      <w:r>
-        <w:rPr>
-          <w:b w:val="0"/>
-          <w:sz w:val="21"/>
-        </w:rPr>
-        <w:t xml:space="preserve"> —*"que el cristal sea el culpable no está medido"*— pero su</w:t>
+        <w:t xml:space="preserve"> pelado el pin necesita resistencia real a masa en la placa o</w:t>
       </w:r>
     </w:p>
     <w:p>
@@ -3592,284 +1023,14 @@
           <w:b w:val="0"/>
           <w:sz w:val="21"/>
         </w:rPr>
-        <w:t xml:space="preserve">cabecera lo fecha: </w:t>
-      </w:r>
-      <w:r>
-        <w:rPr>
-          <w:b/>
-          <w:sz w:val="21"/>
-        </w:rPr>
-        <w:t>«Última revisión: 31 de julio de 2026»</w:t>
-      </w:r>
-      <w:r>
-        <w:rPr>
-          <w:b w:val="0"/>
-          <w:sz w:val="21"/>
-        </w:rPr>
-        <w:t xml:space="preserve">, un día </w:t>
-      </w:r>
-      <w:r>
-        <w:rPr>
-          <w:b/>
-          <w:sz w:val="21"/>
-        </w:rPr>
-        <w:t>antes</w:t>
-      </w:r>
-      <w:r>
-        <w:rPr>
-          <w:b w:val="0"/>
-          <w:sz w:val="21"/>
-        </w:rPr>
-        <w:t xml:space="preserve"> de la medida de</w:t>
-      </w:r>
-    </w:p>
-    <w:p>
-      <w:pPr>
-        <w:spacing w:after="120"/>
-      </w:pPr>
-      <w:r>
-        <w:rPr>
-          <w:b w:val="0"/>
-          <w:sz w:val="21"/>
-        </w:rPr>
-        <w:t>banco. No es una contradicción: es un documento sin actualizar, y hay que corregirlo antes de que</w:t>
-      </w:r>
-    </w:p>
-    <w:p>
-      <w:pPr>
-        <w:spacing w:after="120"/>
-      </w:pPr>
-      <w:r>
-        <w:rPr>
-          <w:b w:val="0"/>
-          <w:sz w:val="21"/>
-        </w:rPr>
-        <w:t>alguien lo cite como si valiera.</w:t>
-      </w:r>
-    </w:p>
-    <w:p>
-      <w:pPr>
-        <w:spacing w:before="200" w:after="120"/>
-      </w:pPr>
-      <w:r>
-        <w:rPr>
-          <w:b/>
-          <w:color w:val="003366"/>
-          <w:sz w:val="23"/>
-        </w:rPr>
-        <w:t>Por qué esto invalida la arquitectura de V9.0</w:t>
-      </w:r>
-    </w:p>
-    <w:p>
-      <w:pPr>
-        <w:pStyle w:val="ListNumber"/>
-        <w:spacing w:after="60"/>
-      </w:pPr>
-      <w:r>
-        <w:rPr>
-          <w:b w:val="0"/>
-          <w:sz w:val="21"/>
-        </w:rPr>
-        <w:t xml:space="preserve">El firmware sigue en </w:t>
+        <w:t xml:space="preserve">queda flotando y el ruido dispara demandas fantasma; de </w:t>
       </w:r>
       <w:r>
         <w:rPr>
           <w:rFonts w:ascii="Consolas" w:hAnsi="Consolas"/>
           <w:sz w:val="21"/>
         </w:rPr>
-        <w:t>STM32RTC</w:t>
-      </w:r>
-      <w:r>
-        <w:rPr>
-          <w:b w:val="0"/>
-          <w:sz w:val="21"/>
-        </w:rPr>
-        <w:t xml:space="preserve"> sobre el cristal muerto (</w:t>
-      </w:r>
-      <w:r>
-        <w:rPr>
-          <w:rFonts w:ascii="Consolas" w:hAnsi="Consolas"/>
-          <w:sz w:val="21"/>
-        </w:rPr>
-        <w:t>reloj.cpp:109</w:t>
-      </w:r>
-      <w:r>
-        <w:rPr>
-          <w:b w:val="0"/>
-          <w:sz w:val="21"/>
-        </w:rPr>
-        <w:t xml:space="preserve">, </w:t>
-      </w:r>
-      <w:r>
-        <w:rPr>
-          <w:rFonts w:ascii="Consolas" w:hAnsi="Consolas"/>
-          <w:sz w:val="21"/>
-        </w:rPr>
-        <w:t>LSE_CLOCK</w:t>
-      </w:r>
-      <w:r>
-        <w:rPr>
-          <w:b w:val="0"/>
-          <w:sz w:val="21"/>
-        </w:rPr>
-        <w:t>). **No hay</w:t>
-      </w:r>
-    </w:p>
-    <w:p>
-      <w:pPr>
-        <w:spacing w:after="120"/>
-      </w:pPr>
-      <w:r>
-        <w:rPr>
-          <w:b w:val="0"/>
-          <w:sz w:val="21"/>
-        </w:rPr>
-        <w:t xml:space="preserve">driver </w:t>
-      </w:r>
-      <w:r>
-        <w:rPr>
-          <w:rFonts w:ascii="Consolas" w:hAnsi="Consolas"/>
-          <w:sz w:val="21"/>
-        </w:rPr>
-        <w:t>DS3231</w:t>
-      </w:r>
-      <w:r>
-        <w:rPr>
-          <w:b w:val="0"/>
-          <w:sz w:val="21"/>
-        </w:rPr>
-        <w:t>.**</w:t>
-      </w:r>
-    </w:p>
-    <w:p>
-      <w:pPr>
-        <w:pStyle w:val="ListNumber"/>
-        <w:spacing w:after="60"/>
-      </w:pPr>
-      <w:r>
-        <w:rPr>
-          <w:b w:val="0"/>
-          <w:sz w:val="21"/>
-        </w:rPr>
-        <w:t xml:space="preserve">V9.0 acaba de darle a las cámaras </w:t>
-      </w:r>
-      <w:r>
-        <w:rPr>
-          <w:b/>
-          <w:sz w:val="21"/>
-        </w:rPr>
-        <w:t>los dos pines que el reloj necesita</w:t>
-      </w:r>
-      <w:r>
-        <w:rPr>
-          <w:b w:val="0"/>
-          <w:sz w:val="21"/>
-        </w:rPr>
-        <w:t>.</w:t>
-      </w:r>
-    </w:p>
-    <w:p>
-      <w:pPr>
-        <w:pStyle w:val="ListNumber"/>
-        <w:spacing w:after="60"/>
-      </w:pPr>
-      <w:r>
-        <w:rPr>
-          <w:b w:val="0"/>
-          <w:sz w:val="21"/>
-        </w:rPr>
-        <w:t xml:space="preserve">Sin reloj no hay Modo Degradado: </w:t>
-      </w:r>
-      <w:r>
-        <w:rPr>
-          <w:rFonts w:ascii="Consolas" w:hAnsi="Consolas"/>
-          <w:sz w:val="21"/>
-        </w:rPr>
-        <w:t>SFTY-18</w:t>
-      </w:r>
-      <w:r>
-        <w:rPr>
-          <w:b w:val="0"/>
-          <w:sz w:val="21"/>
-        </w:rPr>
-        <w:t xml:space="preserve"> lo prohíbe, y con razón.</w:t>
-      </w:r>
-    </w:p>
-    <w:p>
-      <w:pPr>
-        <w:spacing w:before="200" w:after="120"/>
-      </w:pPr>
-      <w:r>
-        <w:rPr>
-          <w:b/>
-          <w:color w:val="003366"/>
-          <w:sz w:val="23"/>
-        </w:rPr>
-        <w:t>Y la salida que aparece al mirarlo entero</w:t>
-      </w:r>
-    </w:p>
-    <w:p>
-      <w:pPr>
-        <w:spacing w:after="120"/>
-      </w:pPr>
-      <w:r>
-        <w:rPr>
-          <w:b w:val="0"/>
-          <w:sz w:val="21"/>
-        </w:rPr>
-        <w:t xml:space="preserve">De los dos pines de cámara, </w:t>
-      </w:r>
-      <w:r>
-        <w:rPr>
-          <w:b/>
-          <w:sz w:val="21"/>
-        </w:rPr>
-        <w:t>`PB8` no se lee nunca</w:t>
-      </w:r>
-      <w:r>
-        <w:rPr>
-          <w:b w:val="0"/>
-          <w:sz w:val="21"/>
-        </w:rPr>
-        <w:t xml:space="preserve"> (§1). O sea que la demanda real necesita **un</w:t>
-      </w:r>
-    </w:p>
-    <w:p>
-      <w:pPr>
-        <w:spacing w:after="120"/>
-      </w:pPr>
-      <w:r>
-        <w:rPr>
-          <w:b w:val="0"/>
-          <w:sz w:val="21"/>
-        </w:rPr>
-        <w:t>solo pin**, no dos. Y aun así 1 + 2 = 3 &gt; 2.</w:t>
-      </w:r>
-    </w:p>
-    <w:p>
-      <w:pPr>
-        <w:spacing w:after="120"/>
-      </w:pPr>
-      <w:r>
-        <w:rPr>
-          <w:b/>
-          <w:sz w:val="21"/>
-        </w:rPr>
-        <w:t>Un expansor `PCF8574` en el mismo bus I²C lo resuelve:</w:t>
-      </w:r>
-      <w:r>
-        <w:rPr>
-          <w:b w:val="0"/>
-          <w:sz w:val="21"/>
-        </w:rPr>
-        <w:t xml:space="preserve"> cuelga de </w:t>
-      </w:r>
-      <w:r>
-        <w:rPr>
-          <w:rFonts w:ascii="Consolas" w:hAnsi="Consolas"/>
-          <w:sz w:val="21"/>
-        </w:rPr>
-        <w:t>PB0</w:t>
+        <w:t>PB14</w:t>
       </w:r>
       <w:r>
         <w:rPr>
@@ -3883,28 +1044,28 @@
           <w:rFonts w:ascii="Consolas" w:hAnsi="Consolas"/>
           <w:sz w:val="21"/>
         </w:rPr>
-        <w:t>PB8</w:t>
+        <w:t>PB15</w:t>
       </w:r>
       <w:r>
         <w:rPr>
           <w:b w:val="0"/>
           <w:sz w:val="21"/>
         </w:rPr>
-        <w:t xml:space="preserve"> junto al </w:t>
+        <w:t xml:space="preserve"> </w:t>
       </w:r>
       <w:r>
         <w:rPr>
-          <w:rFonts w:ascii="Consolas" w:hAnsi="Consolas"/>
+          <w:b/>
           <w:sz w:val="21"/>
         </w:rPr>
-        <w:t>DS3231</w:t>
+        <w:t>solo lo dice el netlist</w:t>
       </w:r>
       <w:r>
         <w:rPr>
           <w:b w:val="0"/>
           <w:sz w:val="21"/>
         </w:rPr>
-        <w:t>,</w:t>
+        <w:t>—.</w:t>
       </w:r>
     </w:p>
     <w:p>
@@ -3916,21 +1077,94 @@
           <w:b w:val="0"/>
           <w:sz w:val="21"/>
         </w:rPr>
-        <w:t xml:space="preserve">cuesta céntimos, y aporta </w:t>
+        <w:t xml:space="preserve">Y el orden es </w:t>
       </w:r>
       <w:r>
         <w:rPr>
           <w:b/>
           <w:sz w:val="21"/>
         </w:rPr>
-        <w:t>8 entradas digitales</w:t>
+        <w:t>firmware cargado en la tarjeta primero, cableado después</w:t>
       </w:r>
       <w:r>
         <w:rPr>
           <w:b w:val="0"/>
           <w:sz w:val="21"/>
         </w:rPr>
-        <w:t xml:space="preserve"> para las cámaras — con lo que sobran seis.</w:t>
+        <w:t>: un commit no protege de</w:t>
+      </w:r>
+    </w:p>
+    <w:p>
+      <w:pPr>
+        <w:spacing w:after="120"/>
+      </w:pPr>
+      <w:r>
+        <w:rPr>
+          <w:b w:val="0"/>
+          <w:sz w:val="21"/>
+        </w:rPr>
+        <w:t>un destornillador.</w:t>
+      </w:r>
+    </w:p>
+    <w:p>
+      <w:pPr>
+        <w:spacing w:before="200" w:after="120"/>
+      </w:pPr>
+      <w:r>
+        <w:rPr>
+          <w:b/>
+          <w:color w:val="003366"/>
+          <w:sz w:val="23"/>
+        </w:rPr>
+        <w:t>📕 El hallazgo original, tal como se escribió el 26/08 — se conserva</w:t>
+      </w:r>
+    </w:p>
+    <w:p>
+      <w:pPr>
+        <w:spacing w:after="120"/>
+      </w:pPr>
+      <w:r>
+        <w:rPr>
+          <w:b w:val="0"/>
+          <w:sz w:val="21"/>
+        </w:rPr>
+        <w:t>~~```</w:t>
+      </w:r>
+    </w:p>
+    <w:p>
+      <w:pPr>
+        <w:spacing w:after="120"/>
+      </w:pPr>
+      <w:r>
+        <w:rPr>
+          <w:b w:val="0"/>
+          <w:sz w:val="21"/>
+        </w:rPr>
+        <w:t>$ grep -rn "CAM_UMBRAL_PIN" --include=*.cpp Maestro/src Esclavo/src</w:t>
+      </w:r>
+    </w:p>
+    <w:p>
+      <w:pPr>
+        <w:spacing w:after="120"/>
+      </w:pPr>
+      <w:r>
+        <w:rPr>
+          <w:b w:val="0"/>
+          <w:sz w:val="21"/>
+        </w:rPr>
+        <w:t>Maestro/src/modo_inteligente.cpp:29:  pinMode(CAM_UMBRAL_PIN, INPUT_PULLUP);</w:t>
+      </w:r>
+    </w:p>
+    <w:p>
+      <w:pPr>
+        <w:spacing w:after="120"/>
+      </w:pPr>
+      <w:r>
+        <w:rPr>
+          <w:b w:val="0"/>
+          <w:sz w:val="21"/>
+        </w:rPr>
+        <w:t>Esclavo/src/main.cpp:275:            pinMode(CAM_UMBRAL_PIN, INPUT_PULLUP);</w:t>
       </w:r>
     </w:p>
     <w:p>
@@ -3944,32 +1178,102 @@
           <w:rFonts w:ascii="Consolas" w:hAnsi="Consolas"/>
           <w:sz w:val="18"/>
         </w:rPr>
-        <w:t xml:space="preserve">   PB0 (SDA) ──┬─────────────┬───────────────</w:t>
         <w:br/>
-        <w:t xml:space="preserve">   PB8 (SCL) ──┴──┐       ┌──┴──┐</w:t>
+        <w:t>~~**Eso es todo.** El pin se configura como entrada y **no se lee nunca**: no hay un solo</w:t>
         <w:br/>
-        <w:t xml:space="preserve">                  │       │     │</w:t>
+        <w:t>`digitalRead(CAM_UMBRAL_PIN)` en ninguno de los dos microcontroladores.~~</w:t>
         <w:br/>
-        <w:t xml:space="preserve">              [DS3231]  [PCF8574]  ← 8 entradas: camaras 1..4 y margen</w:t>
-      </w:r>
-    </w:p>
-    <w:p>
-      <w:pPr>
-        <w:spacing w:after="120"/>
-      </w:pPr>
-      <w:r>
-        <w:rPr>
-          <w:b/>
-          <w:sz w:val="21"/>
-        </w:rPr>
-        <w:t>Ventaja adicional que no es menor:</w:t>
-      </w:r>
-      <w:r>
-        <w:rPr>
-          <w:b w:val="0"/>
-          <w:sz w:val="21"/>
-        </w:rPr>
-        <w:t xml:space="preserve"> deja de haber pines libres en disputa. Cualquier entrada</w:t>
+        <w:br/>
+        <w:t>~~Mientras tanto, **cuatro documentos afirman lo contrario**: el Manual 9 de cámaras, el Manual 10 de</w:t>
+        <w:br/>
+        <w:t>Bluetooth, `ESTADO.md` y `roadmap.md` describen `PB8` como *"Umbral de tramo"* con función activa.~~</w:t>
+        <w:br/>
+        <w:br/>
+        <w:t>&gt; **Un `pinMode()` sin `digitalRead()` es exactamente el patrón de la prueba muerta que este</w:t>
+        <w:br/>
+        <w:t>&gt; repositorio ya conoce:** algo que *parece* conectado, que compila, que pasa la compuerta, y que no</w:t>
+        <w:br/>
+        <w:t>&gt; hace nada. Se descubrió censando, no leyendo el manual — porque el manual decía que sí funcionaba.</w:t>
+        <w:br/>
+        <w:t>&gt;</w:t>
+        <w:br/>
+        <w:t>&gt; **Esta frase se conserva sin tachar: es la lección, y no ha caducado.**</w:t>
+        <w:br/>
+        <w:br/>
+        <w:t>---</w:t>
+        <w:br/>
+        <w:br/>
+        <w:t>## 2. Superficie de entrada completa, cruzada con el banco</w:t>
+        <w:br/>
+        <w:br/>
+        <w:t>Todo lo que puede meter información al sistema, y qué lo prueba:</w:t>
+        <w:br/>
+        <w:br/>
+        <w:t>&gt; ⚠️ **Tabla revisada el 31/08.** Las columnas de recuento se retiran: **el número de comprobaciones</w:t>
+        <w:br/>
+        <w:t>&gt; de cada pack se lee del acta**, no de aquí. Lo que esta tabla dice es **qué existe y qué no**.</w:t>
+        <w:br/>
+        <w:br/>
+        <w:t>| # | Entrada | Canal | Qué acepta | Pack que lo cubre | Estado |</w:t>
+        <w:br/>
+        <w:t>|---|---|---|---|---|---|</w:t>
+        <w:br/>
+        <w:t>| 1 | ~~4~~ **2** botones locales | ~~`PB9` `PB13` `PB14` `PB15`~~ **`PB9` `PB13`** | secuencias A/B | `maestro_01_mando`, `esclavo_02_inhibicion_menu` | ✅ |</w:t>
+        <w:br/>
+        <w:t>| 2 | Mando de ~~4~~ **2** relés | **los mismos 2 pines** | idem | idem | ✅ |</w:t>
+        <w:br/>
+        <w:t>| 3 | Cámara de demanda | `PB0` | binario con antirrebote | 🟢 **`camara_01_demanda`** | ✅ *(era ❌)* |</w:t>
+        <w:br/>
+        <w:t>| 4 | ~~Cámara de umbral (`PB8`)~~ | — | **no existe: `PB8` es `LED_TESTIGO`** | — | ✅ **cerrado, §1** |</w:t>
+        <w:br/>
+        <w:t>| 4.bis | 🆕 **Cámaras `C`/`D` en `J16`** | `PB14` `PB15` | contacto seco, **activo en ALTO** | 🟢 **`camara_02_j16`** | ✅ |</w:t>
+        <w:br/>
+        <w:t>| 5 | Radio LoRa | `USART3` | comandos `CMD_*` | `costura_03_comandos` | ⚠️ parcial |</w:t>
+        <w:br/>
+        <w:t>| 6 | Bluetooth Maestro | `USART1` **por `J17`** (`PB6`/`PB7`) | **17 formas** | 🟢 **`app_01_comandos`, `app_02_modos_simetricos`, `app_03_sin_ok_mudo`, `app_04_valores_de_status`, `app_06_formato_de_hora`** | ✅ *(era ❌)* |</w:t>
+        <w:br/>
+        <w:t>| 7 | Bluetooth Esclavo | `USART1` **por `J17`** | 4 aceptados + 3 rechazados | 🟢 **`esclavo_06_no_abre_paso`** + los `app_0x` | ✅ *(era ❌)* |</w:t>
+        <w:br/>
+        <w:t>| 8 | Respaldo en pila | BKP RAM | firma + checksum | `maestro_02_respaldo` | ✅ |</w:t>
+        <w:br/>
+        <w:t>| 9 | Reloj / pila | RTC | hora, validez | `maestro_04_sync_horaria`, `esclavo_05_hora_atomica` | ✅ |</w:t>
+        <w:br/>
+        <w:t>| 10 | Corte de energía | — | reanudación | `costura_06_reanudacion` | ✅ |</w:t>
+        <w:br/>
+        <w:t>| 11 | 🆕 **Reloj `DS3231` del ESP32** | I²C `GPIO21`/`GPIO22` | hora, bit `OSF` | ⚠️ **por censar** — el firmware existe (`ESP32_Expansion/src/reloj_ds3231.cpp`) y **la compuerta lo compila** | ⚠️ |</w:t>
+        <w:br/>
+        <w:br/>
+        <w:t>~~**El patrón salta a la vista: todo lo anterior a V9.0 está cubierto; todo lo que V9.0 añadió, no.**</w:t>
+        <w:br/>
+        <w:t>Los 20 packs suman `155/155` — exactamente los mismos que antes del Bluetooth, las cámaras y los dos</w:t>
+        <w:br/>
+        <w:t>comandos de radio nuevos.~~</w:t>
+        <w:br/>
+        <w:br/>
+        <w:t>&gt; ## ✅ 31/08 — EL PATRÓN SE HA INVERTIDO, Y ERA EL PUNTO DE ESTE DOCUMENTO</w:t>
+        <w:br/>
+        <w:t>&gt;</w:t>
+        <w:br/>
+        <w:t>&gt; Las cuatro filas que el 26/08 decían **«ninguno»** —cámara de demanda, Bluetooth del Maestro,</w:t>
+        <w:br/>
+        <w:t>&gt; Bluetooth del Esclavo y el pin de umbral— **hoy tienen pack**, y hay packs nuevos que en aquella</w:t>
+        <w:br/>
+        <w:t>&gt; pasada ni se listaron. **La cifra de comprobaciones no se copia aquí**: se lee del acta.</w:t>
+        <w:br/>
+        <w:t>&gt;</w:t>
+        <w:br/>
+        <w:t>&gt; ⚠️ **Y un pack que existe no es un pack que mida.** Antes de contar uno como cobertura hay que</w:t>
+        <w:br/>
+        <w:t>&gt; haberle roto el firmware a propósito y haberlo visto **bajar la cuenta y cambiar el código de</w:t>
+        <w:br/>
+        <w:t>&gt; salida**. Un arnés que nadie ha visto fallar es un adorno que da verde.</w:t>
+        <w:br/>
+        <w:br/>
+        <w:t>### 2.bis Los comandos de radio, uno a uno</w:t>
+        <w:br/>
+        <w:br/>
+        <w:t>`protocolo.h` define 18. `costura_03_comandos.py` no se toca desde la Fase 2:</w:t>
+        <w:br/>
       </w:r>
     </w:p>
     <w:p>
@@ -3981,26 +1285,7 @@
           <w:b w:val="0"/>
           <w:sz w:val="21"/>
         </w:rPr>
-        <w:t>futura entra por el expansor sin volver a abrir esta discusión.</w:t>
-      </w:r>
-    </w:p>
-    <w:p>
-      <w:pPr>
-        <w:spacing w:after="120"/>
-      </w:pPr>
-      <w:r>
-        <w:rPr>
-          <w:b/>
-          <w:sz w:val="21"/>
-        </w:rPr>
-        <w:t>Riesgo a medir, no a suponer:</w:t>
-      </w:r>
-      <w:r>
-        <w:rPr>
-          <w:b w:val="0"/>
-          <w:sz w:val="21"/>
-        </w:rPr>
-        <w:t xml:space="preserve"> el I²C es por software y ahora tendría dos esclavos; hay que</w:t>
+        <w:t>CMD_GO_GREEN  CMD_GO_RED  CMD_ACK_GREEN  CMD_PING  CMD_PONG  CMD_ACK_RED</w:t>
       </w:r>
     </w:p>
     <w:p>
@@ -4012,21 +1297,7 @@
           <w:b w:val="0"/>
           <w:sz w:val="21"/>
         </w:rPr>
-        <w:t xml:space="preserve">comprobar que la latencia de leer el expansor no compite con el </w:t>
-      </w:r>
-      <w:r>
-        <w:rPr>
-          <w:rFonts w:ascii="Consolas" w:hAnsi="Consolas"/>
-          <w:sz w:val="21"/>
-        </w:rPr>
-        <w:t>IWDG</w:t>
-      </w:r>
-      <w:r>
-        <w:rPr>
-          <w:b w:val="0"/>
-          <w:sz w:val="21"/>
-        </w:rPr>
-        <w:t xml:space="preserve"> ni con el bit-bang del LCD.</w:t>
+        <w:t>CMD_HORA_D  CMD_HORA_H  CMD_HORA_M  CMD_HORA_S  CMD_ACK_HORA</w:t>
       </w:r>
     </w:p>
     <w:p>
@@ -4038,6 +1309,410 @@
           <w:b w:val="0"/>
           <w:sz w:val="21"/>
         </w:rPr>
+        <w:t>CMD_DELTA  CMD_DELTA_RESP  CMD_CONFIG_VERDE  CMD_CONFIG_DESPEJE  CMD_ACK_CONFIG</w:t>
+      </w:r>
+    </w:p>
+    <w:p>
+      <w:pPr>
+        <w:spacing w:after="120"/>
+      </w:pPr>
+      <w:r>
+        <w:rPr>
+          <w:b w:val="0"/>
+          <w:sz w:val="21"/>
+        </w:rPr>
+        <w:t>CMD_DEMANDA  CMD_ACK_DEMANDA          &lt;- los dos nuevos, sin cubrir</w:t>
+      </w:r>
+    </w:p>
+    <w:p>
+      <w:pPr>
+        <w:spacing w:after="200"/>
+        <w:ind w:left="288"/>
+        <w:shd w:val="clear" w:fill="F4F4F4"/>
+      </w:pPr>
+      <w:r>
+        <w:rPr>
+          <w:rFonts w:ascii="Consolas" w:hAnsi="Consolas"/>
+          <w:sz w:val="18"/>
+        </w:rPr>
+        <w:br/>
+        <w:t>---</w:t>
+        <w:br/>
+        <w:br/>
+        <w:t>## 3. Invariantes de seguridad, y quién intenta romperlos</w:t>
+        <w:br/>
+        <w:br/>
+        <w:t>Un invariante sin una prueba que **intente violarlo** es una intención, no una garantía.</w:t>
+        <w:br/>
+        <w:br/>
+        <w:t>| Invariante | ¿Quién lo intenta romper? *(revisado 31/08)* |</w:t>
+        <w:br/>
+        <w:t>|---|---|</w:t>
+        <w:br/>
+        <w:t>| Ningún pin de luz se escribe fuera de `semaforo.cpp` | `barrera_01_pines_de_luz` ✅ — ⚠️ ver el matiz de abajo |</w:t>
+        <w:br/>
+        <w:t>| Nunca verde y rojo a la vez en la misma cabeza (SFTY-2) | `Validacion_Automatico`, sobre pines escritos ✅ |</w:t>
+        <w:br/>
+        <w:t>| ~~**Nunca verde simultáneo en las DOS puntas** — 🔴 nadie~~ | 🟢 **`barrera_02_dos_puntas`** *(era el hueco más caro del documento)* |</w:t>
+        <w:br/>
+        <w:t>| El despeje nunca baja del configurado | ⚠️ indirecto en `costura_02` |</w:t>
+        <w:br/>
+        <w:t>| No se reanuda el Degradado sin autorización válida | `costura_06`, `maestro_03_puerta_degradado` ✅ |</w:t>
+        <w:br/>
+        <w:t>| Un equipo sin hora no autoriza el Degradado | `maestro_04`, `esclavo_05` ✅ |</w:t>
+        <w:br/>
+        <w:t>| ~~**Un comando de Bluetooth no abre paso sin PIN** — 🔴 nadie~~ | 🟢 **`app_01_comandos`, `app_02_modos_simetricos`, `app_03_sin_ok_mudo`** y **`esclavo_06_no_abre_paso`** |</w:t>
+        <w:br/>
+        <w:t>| 🆕 **Un `$ACK` no promete lo que la llamada no devolvió** | 🟢 **`app_03_sin_ok_mudo`** — encontró **dos ramas** que ninguna revisión humana vio |</w:t>
+        <w:br/>
+        <w:t>| 🆕 **La talanquera** | 🟢 `barrera_03_talanquera` |</w:t>
+        <w:br/>
+        <w:t>| **Un equipo no obedece a una pareja ajena** | 🔴 **nadie** — y hoy no hay ni direccionamiento |</w:t>
+        <w:br/>
+        <w:br/>
+        <w:t>~~La tercera fila es la que mata, y es la que este repositorio ya sabe que no mide.~~</w:t>
+        <w:br/>
+        <w:br/>
+        <w:t>&gt; ## ✅ 31/08 — quedan DOS avisos, y no son el mismo que había</w:t>
+        <w:br/>
+        <w:t>&gt;</w:t>
+        <w:br/>
+        <w:t>&gt; **1. El direccionamiento de pareja sigue sin nadie.** Es hoy el único `🔴` de la tabla.</w:t>
+        <w:br/>
+        <w:t>&gt;</w:t>
+        <w:br/>
+        <w:t>&gt; **2. 🔴 `barrera_01_pines_de_luz` mide menos de lo que su nombre promete.** La regla enumera **ocho**</w:t>
+        <w:br/>
+        <w:t>&gt; pines de luz; `escribirPines()` mueve **seis**. `ROJO_PEATON` (`PA6`), `VERDE_PEATON` (`PA7`) y el</w:t>
+        <w:br/>
+        <w:t>&gt; `BUZZER` (`PB1`) están **declarados en `pines.h` y muertos en las dos puntas** —sin `pinMode`, sin</w:t>
+        <w:br/>
+        <w:t>&gt; `digitalRead`, sin `digitalWrite`—, así que la regla era **vacuamente cierta** para dos de sus ocho</w:t>
+        <w:br/>
+        <w:t>&gt; sujetos. El pack **no podía detectarlo**: solo mide *fugas hacia fuera*, acepta `len(luces) &gt;= 6`</w:t>
+        <w:br/>
+        <w:t>&gt; sobre una lista que devuelve 8, y su `control_negativo` **nunca ejerció un pin peatonal**.</w:t>
+        <w:br/>
+        <w:t>&gt;</w:t>
+        <w:br/>
+        <w:t>&gt; &gt; **Una regla de seguridad que enumera sujetos tiene que comprobar que cada sujeto existe**, no solo</w:t>
+        <w:br/>
+        <w:t>&gt; &gt; que nadie la rodea. Es la misma familia que `CAM_UMBRAL_PIN` de la §1: un `✅` en la columna de la</w:t>
+        <w:br/>
+        <w:t>&gt; &gt; izquierda **no dice qué mide el pack**, solo que hay uno.</w:t>
+        <w:br/>
+        <w:br/>
+        <w:t>---</w:t>
+        <w:br/>
+        <w:br/>
+        <w:t>## 4. Plan de pruebas — qué escribir, y en qué orden</w:t>
+        <w:br/>
+        <w:br/>
+        <w:t>Cada pack se conecta a `compuerta.py` **solo después de haberlo visto fallar** con un defecto</w:t>
+        <w:br/>
+        <w:t>inyectado a propósito en el `.cpp` real (`CLAUDE.md §8.bis`).</w:t>
+        <w:br/>
+        <w:br/>
+        <w:t>| # | Pack | Qué debe romper | Control negativo obligatorio | **31/08** |</w:t>
+        <w:br/>
+        <w:t>|---|---|---|---|---|</w:t>
+        <w:br/>
+        <w:t>| 1 | ~~`bluetooth_01_autorizacion`~~ | que un comando sin PIN válido abra paso | trama sin PIN → rechazada | ✅ **hecho** como `app_01`/`app_02`/`app_03` |</w:t>
+        <w:br/>
+        <w:t>| 2 | ~~`bluetooth_02_esclavo_no_abre`~~ | que el Esclavo ejecute algo que encienda un verde | `TEST_LEDS` en servicio → rechazado | ✅ **hecho** como `esclavo_06_no_abre_paso` |</w:t>
+        <w:br/>
+        <w:t>| 3 | `costura_08_pareja` | que un equipo atienda una trama de otra pareja | `PAIR` ajeno → descartada | 🔴 **sigue pendiente** |</w:t>
+        <w:br/>
+        <w:t>| 4 | ~~`camara_01_demanda`~~ | antirrebote y que la demanda no acorte el despeje | demanda continua → el despeje **no** baja | ✅ **hecho** — y hay además `camara_02_j16` |</w:t>
+        <w:br/>
+        <w:t>| 5 | `costura_03` (ampliar) | que `0x11`/`0x12` cuadren entre las dos puntas | *(el total se lee del acta)* | ⚠️ por confirmar |</w:t>
+        <w:br/>
+        <w:t>| 6 | ~~`barrera_02_dos_puntas`~~ | **verde simultáneo en las dos puntas** | forzar verde en ambos → debe saltar | ✅ **hecho** |</w:t>
+        <w:br/>
+        <w:br/>
+        <w:t>~~El **6** es el que falta desde siempre y el más caro.~~ **El 6 está escrito.** Lo que queda de este</w:t>
+        <w:br/>
+        <w:t>plan es **el 3** —direccionamiento de pareja— y **confirmar el 5**.</w:t>
+        <w:br/>
+        <w:br/>
+        <w:t>&gt; ⚠️ **Y la §5 del control negativo del punto 5 se corrige:** *«totales `7 → 9`»* era una cifra</w:t>
+        <w:br/>
+        <w:t>&gt; escrita a mano. **Un control negativo se expresa como una propiedad, no como un número que este</w:t>
+        <w:br/>
+        <w:t>&gt; documento tendría que ir persiguiendo**; el recuento vive en el acta.</w:t>
+        <w:br/>
+        <w:br/>
+        <w:t>&gt; ## 🔴 Lo que esta lista NO cubre y hay que añadirle (31/08)</w:t>
+        <w:br/>
+        <w:t>&gt;</w:t>
+        <w:br/>
+        <w:t>&gt; | Qué vigilar | Por qué |</w:t>
+        <w:br/>
+        <w:t>&gt; |---|---|</w:t>
+        <w:br/>
+        <w:t>&gt; | **Que `mando_ambarLocal()` siga teniendo armador** | El veto de SFTY-21 no se rompe borrando un `if`: se rompe borrando **quien pone la bandera a `true`**. Los tres consumidores quedan siempre-verdaderos y **ningún test falla**. Hoy tiene dos armadores —`B·B·B` y `CMD:AMBAR_EMERGENCIA`—; el pack debe exigir que **al menos uno** exista |</w:t>
+        <w:br/>
+        <w:t>&gt; | **Que los pines enumerados por una regla EXISTAN** | Ver §3: `barrera_01` acepta `&gt;= 6` sobre una lista de 8 |</w:t>
+        <w:br/>
+        <w:t>&gt; | **Que los literales que un pack busca por texto sigan donde los busca** | Un refactor puede **apagar un instrumento sin romper un solo test**: si los `"$ACK`/`"$ERR` se mudan de fichero, `app_03` pasa a decir *«ninguna rama promete nada»* y **queda en verde midiendo nada** |</w:t>
+        <w:br/>
+        <w:t>&gt; | **El módulo de expansión ESP32** | Compila en la compuerta, pero su superficie —el despachador, el puente y el `DS3231`— **no está en esta tabla**. Un instrumento que no está en la compuerta no mide nada, **y un hueco no deja rastro de que falta** |</w:t>
+        <w:br/>
+        <w:br/>
+        <w:t>---</w:t>
+        <w:br/>
+        <w:br/>
+        <w:t>## 5. Qué NO cubre este documento</w:t>
+        <w:br/>
+        <w:br/>
+        <w:t>- ~~**La app móvil no tiene ninguna prueba**, de ningún tipo. Ni unitaria, ni de integración.~~</w:t>
+        <w:br/>
+        <w:t xml:space="preserve">  ✅ **Superado el 31/08:** la app tiene hoy **cuatro instrumentos en la compuerta** —simulador de app</w:t>
+        <w:br/>
+        <w:t xml:space="preserve">  y Bluetooth, test funcional, test unitarios y **la app ejecutada en DOM**—, más los packs `app_0x`</w:t>
+        <w:br/>
+        <w:t xml:space="preserve">  que la cruzan contra el firmware. **Sus cifras se leen del acta.**</w:t>
+        <w:br/>
+        <w:br/>
+        <w:t xml:space="preserve">  &gt; 🔴 **Pero el aviso que sustituye a aquel es más incómodo:** esos instrumentos ya estuvieron</w:t>
+        <w:br/>
+        <w:t xml:space="preserve">  &gt; **los dos en `ABORTADO` a la vez** —un pack buscaba una rama en `app.js` cuando el parser se</w:t>
+        <w:br/>
+        <w:t xml:space="preserve">  &gt; había mudado a `js/`, y el arnés de DOM reventaba con un `TypeError` sobre una pestaña que ya no</w:t>
+        <w:br/>
+        <w:t xml:space="preserve">  &gt; existía—, y eran justo **los dos únicos que ejercen la app**. Detrás entraron cuatro defectos.</w:t>
+        <w:br/>
+        <w:t xml:space="preserve">  &gt; **Mientras un instrumento está abortado, todo lo que vigilaba entra sin mirar**: un `ABORTADO` no</w:t>
+        <w:br/>
+        <w:t xml:space="preserve">  &gt; se apunta para luego, se arregla antes de mirar nada más.</w:t>
+        <w:br/>
+        <w:br/>
+        <w:t>- 🆕 **Este documento no mide la interfaz.** El contraste WCAG y el comportamiento a distintos anchos</w:t>
+        <w:br/>
+        <w:t xml:space="preserve">  tienen su propio arnés; y **una captura a un solo ancho no es una prueba de interfaz** — las de</w:t>
+        <w:br/>
+        <w:t xml:space="preserve">  `evidencia/` se hicieron a 412 px, el único de cuatro donde cierto corte no aparecía.</w:t>
+        <w:br/>
+        <w:br/>
+        <w:t>- **Nada de esto sustituye la prueba de banco.** Un pack demuestra que el modelo y el código</w:t>
+        <w:br/>
+        <w:t xml:space="preserve">  coinciden; no que la tarjeta encienda una bombilla. **En campo corre la V8.4.**</w:t>
+        <w:br/>
+        <w:br/>
+        <w:br/>
+        <w:t>---</w:t>
+        <w:br/>
+        <w:br/>
+        <w:t>## 6. ✅ CERRADO (31/08) — ~~`PB0`/`PB8` están asignados dos veces~~ · **el reloj se fue del STM32**</w:t>
+        <w:br/>
+        <w:br/>
+        <w:t>&gt; # 🟢 LA DISPUTA POR LOS PINES YA NO EXISTE, Y NO SE RESOLVIÓ CON UN EXPANSOR</w:t>
+        <w:br/>
+        <w:t>&gt;</w:t>
+        <w:br/>
+        <w:t>&gt; **Toda esta sección se sostenía sobre una premisa que hoy es falsa:** que el `DS3231` tenía que</w:t>
+        <w:br/>
+        <w:t>&gt; colgar de `PB0`/`PB8` del STM32. **Ya no.**</w:t>
+        <w:br/>
+        <w:t>&gt;</w:t>
+        <w:br/>
+        <w:t>&gt; | | 26/08 | **31/08 — MEDIDO** |</w:t>
+        <w:br/>
+        <w:t>&gt; |---|---|---|</w:t>
+        <w:br/>
+        <w:t>&gt; | Dónde vive el `DS3231` | *«en `PB0`/`PB8` del STM32, hacen falta DOS»* | **en el módulo de expansión ESP32**, `GPIO21` (`SDA`) / `GPIO22` (`SCL`), **con pila propia** |</w:t>
+        <w:br/>
+        <w:t>&gt; | Driver | *«no hay»* | 🟢 **existe y compila**: `01_Firmware/ESP32_Expansion/src/reloj_ds3231.cpp` |</w:t>
+        <w:br/>
+        <w:t>&gt; | `PB8` | *«cámara de umbral»* | **`LED_TESTIGO`** — LED `D5` por `R16` 1 kΩ. **No es entrada** |</w:t>
+        <w:br/>
+        <w:t>&gt; | `PB0` | disputado | **`CAM_DEMANDA_PIN`, sin disputa** |</w:t>
+        <w:br/>
+        <w:t>&gt; | Cámaras `C`/`D` | sin pines | **`PB14`/`PB15`** (`J16` p10/p12), liberados por el mando |</w:t>
+        <w:br/>
+        <w:t>&gt;</w:t>
+        <w:br/>
+        <w:t>&gt; **La cuenta que bloqueaba —«1 + 2 = 3 &gt; 2»— ya no se plantea:** el reloj no pide pines del STM32 y</w:t>
+        <w:br/>
+        <w:t>&gt; las cámaras tienen tres entradas (`PB0`, `PB14`, `PB15`).</w:t>
+        <w:br/>
+        <w:t>&gt;</w:t>
+        <w:br/>
+        <w:t>&gt; ### 🛑 Y por tanto la propuesta del `PCF8574` QUEDA RETIRADA</w:t>
+        <w:br/>
+        <w:t>&gt;</w:t>
+        <w:br/>
+        <w:t>&gt; No porque fuera mala —resolvía bien el problema que había—, sino porque **el problema desapareció**.</w:t>
+        <w:br/>
+        <w:t>&gt; Montarlo hoy añadiría un segundo esclavo a un bus I²C por software **sin necesidad**, y con él el</w:t>
+        <w:br/>
+        <w:t>&gt; riesgo que la propia sección anotaba: *«hay que comprobar que la latencia de leer el expansor no</w:t>
+        <w:br/>
+        <w:t>&gt; compite con el `IWDG` ni con el bit-bang del LCD»*. **Ese riesgo ya no hace falta correrlo.**</w:t>
+        <w:br/>
+        <w:t>&gt;</w:t>
+        <w:br/>
+        <w:t>&gt; ### 📌 Lo que de esta sección SIGUE EN PIE</w:t>
+        <w:br/>
+        <w:t>&gt;</w:t>
+        <w:br/>
+        <w:t>&gt; - **`Y2` está muerto** (N-37, banco del 01/08). El STM32 no puede fiarse de su cristal, y por eso</w:t>
+        <w:br/>
+        <w:t>&gt;   el reloj bueno vive ahora en el ESP32. **No es un plan: el firmware existe.**</w:t>
+        <w:br/>
+        <w:t>&gt; - **Sin reloj no hay Modo Degradado**, y SFTY-18 lo prohíbe con razón.</w:t>
+        <w:br/>
+        <w:t>&gt; - **La lección de método, que es lo que no caduca:** un documento fechado **antes** de una medida</w:t>
+        <w:br/>
+        <w:t>&gt;   de banco no contradice esa medida — **está sin actualizar**, y hay que corregirlo antes de que</w:t>
+        <w:br/>
+        <w:t>&gt;   alguien lo cite como si valiera. Es exactamente lo que le acaba de pasar a esta sección.</w:t>
+        <w:br/>
+        <w:t>&gt;</w:t>
+        <w:br/>
+        <w:t>&gt; **Lo que sigue se conserva sin borrar, como histórico del razonamiento.**</w:t>
+        <w:br/>
+        <w:br/>
+        <w:t>---</w:t>
+        <w:br/>
+        <w:br/>
+        <w:t>### 📕 HISTÓRICO — el hallazgo del 26/08, superado</w:t>
+        <w:br/>
+        <w:br/>
+        <w:t>Esta pasada cruzó **todos** los documentos que nombran `PB0` o `PB8`. El resultado no es una errata:</w:t>
+        <w:br/>
+        <w:br/>
+        <w:t>| Documento | Dice que `PB0`/`PB8` son… | Fecha |</w:t>
+        <w:br/>
+        <w:t>|---|---|---|</w:t>
+        <w:br/>
+        <w:t>| `roadmap.md` **N-37** | **`SDA`/`SCL` del `DS3231`** — *"los únicos pines libres"* | **cerrado en banco el 01/08/2026** |</w:t>
+        <w:br/>
+        <w:t>| Manual 11 · `MANUAL_INSTALACION_RELOJ_DS3231.md` | `SDA`/`SCL` del `DS3231` | V9.0 |</w:t>
+        <w:br/>
+        <w:t>| Manual 9 · Manual 2 · `MAPEO:179` · `ESTADO.md` | **cámaras IA** (demanda y umbral) | V9.0 |</w:t>
+        <w:br/>
+        <w:br/>
+        <w:t>**No caben las dos cosas.** Y la que llegó primero tiene evidencia de banco detrás.</w:t>
+        <w:br/>
+        <w:br/>
+        <w:t>### Lo que dice N-37, y por qué no es negociable</w:t>
+        <w:br/>
+        <w:br/>
+        <w:t>&gt; *"**CERRADO POR ELIMINACIÓN: el cristal `Y2` está MUERTO. Banco del 01/08/2026.**"*</w:t>
+        <w:br/>
+        <w:br/>
+        <w:t>Con tres eliminaciones medidas —`VBAT` a 3 V con la tarjeta apagada, el reintento de `N-25`, y</w:t>
+        <w:br/>
+        <w:t>`REINICIAR RELOJ` devolviendo `SIGUE PARADO`—. Y su conclusión: *"Ya no queda software que probar.</w:t>
+        <w:br/>
+        <w:t>**Salida: `DS3231` por I²C software en `PB0`/`PB8`.** Hacen falta **DOS**"*.</w:t>
+        <w:br/>
+        <w:br/>
+        <w:t>**El `MAPEO §4` dice lo contrario** —*"que el cristal sea el culpable no está medido"*— pero su</w:t>
+        <w:br/>
+        <w:t>cabecera lo fecha: **«Última revisión: 31 de julio de 2026»**, un día **antes** de la medida de</w:t>
+        <w:br/>
+        <w:t>banco. No es una contradicción: es un documento sin actualizar, y hay que corregirlo antes de que</w:t>
+        <w:br/>
+        <w:t>alguien lo cite como si valiera.</w:t>
+        <w:br/>
+        <w:br/>
+        <w:t>### Por qué esto invalida la arquitectura de V9.0</w:t>
+        <w:br/>
+        <w:br/>
+        <w:t>1. El firmware sigue en `STM32RTC` sobre el cristal muerto (`reloj.cpp:109`, `LSE_CLOCK`). **No hay</w:t>
+        <w:br/>
+        <w:t xml:space="preserve">   driver `DS3231`.**</w:t>
+        <w:br/>
+        <w:t>2. V9.0 acaba de darle a las cámaras **los dos pines que el reloj necesita**.</w:t>
+        <w:br/>
+        <w:t>3. Sin reloj no hay Modo Degradado: `SFTY-18` lo prohíbe, y con razón.</w:t>
+        <w:br/>
+        <w:br/>
+        <w:t>### Y la salida que aparece al mirarlo entero</w:t>
+        <w:br/>
+        <w:br/>
+        <w:t>De los dos pines de cámara, **`PB8` no se lee nunca** (§1). O sea que la demanda real necesita **un</w:t>
+        <w:br/>
+        <w:t>solo pin**, no dos. Y aun así 1 + 2 = 3 &gt; 2.</w:t>
+        <w:br/>
+        <w:br/>
+        <w:t>**Un expansor `PCF8574` en el mismo bus I²C lo resuelve:** cuelga de `PB0`/`PB8` junto al `DS3231`,</w:t>
+        <w:br/>
+        <w:t>cuesta céntimos, y aporta **8 entradas digitales** para las cámaras — con lo que sobran seis.</w:t>
+        <w:br/>
+      </w:r>
+    </w:p>
+    <w:p>
+      <w:pPr>
+        <w:spacing w:after="120"/>
+      </w:pPr>
+      <w:r>
+        <w:rPr>
+          <w:b w:val="0"/>
+          <w:sz w:val="21"/>
+        </w:rPr>
+        <w:t>PB0 (SDA) ──┬─────────────┬───────────────</w:t>
+      </w:r>
+    </w:p>
+    <w:p>
+      <w:pPr>
+        <w:spacing w:after="120"/>
+      </w:pPr>
+      <w:r>
+        <w:rPr>
+          <w:b w:val="0"/>
+          <w:sz w:val="21"/>
+        </w:rPr>
+        <w:t>PB8 (SCL) ──┴──┐       ┌──┴──┐</w:t>
+      </w:r>
+    </w:p>
+    <w:p>
+      <w:pPr>
+        <w:spacing w:after="120"/>
+      </w:pPr>
+      <w:r>
+        <w:rPr>
+          <w:b w:val="0"/>
+          <w:sz w:val="21"/>
+        </w:rPr>
+        <w:t>│       │     │</w:t>
+      </w:r>
+    </w:p>
+    <w:p>
+      <w:pPr>
+        <w:spacing w:after="120"/>
+      </w:pPr>
+      <w:r>
+        <w:rPr>
+          <w:b w:val="0"/>
+          <w:sz w:val="21"/>
+        </w:rPr>
+        <w:t>[DS3231]  [PCF8574]  ← 8 entradas: camaras 1..4 y margen</w:t>
+      </w:r>
+    </w:p>
+    <w:p>
+      <w:pPr>
+        <w:spacing w:after="200"/>
+        <w:ind w:left="288"/>
+        <w:shd w:val="clear" w:fill="F4F4F4"/>
+      </w:pPr>
+      <w:r>
+        <w:rPr>
+          <w:rFonts w:ascii="Consolas" w:hAnsi="Consolas"/>
+          <w:sz w:val="18"/>
+        </w:rPr>
+        <w:br/>
+        <w:t>**Ventaja adicional que no es menor:** deja de haber pines libres en disputa. Cualquier entrada</w:t>
+        <w:br/>
+        <w:t>futura entra por el expansor sin volver a abrir esta discusión.</w:t>
+        <w:br/>
+        <w:br/>
+        <w:t>**Riesgo a medir, no a suponer:** el I²C es por software y ahora tendría dos esclavos; hay que</w:t>
+        <w:br/>
+        <w:t>comprobar que la latencia de leer el expansor no compite con el `IWDG` ni con el bit-bang del LCD.</w:t>
+        <w:br/>
         <w:t>Eso se mide en banco, no aquí.</w:t>
       </w:r>
     </w:p>

</xml_diff>